<commit_message>
update task info WBS 11, 24, 25; Update Task info templates; update WBS
</commit_message>
<xml_diff>
--- a/Documentation/Analysis/Task Informations/Templates/Task Info Template - W.docx
+++ b/Documentation/Analysis/Task Informations/Templates/Task Info Template - W.docx
@@ -6,18 +6,6 @@
       <w:pPr>
         <w:pStyle w:val="Title"/>
         <w:bidi w:val="0"/>
-        <w:rPr>
-          <w:outline w:val="0"/>
-          <w:color w:val="ee0000"/>
-          <w:sz w:val="28"/>
-          <w:szCs w:val="28"/>
-          <w:u w:color="ee0000"/>
-          <w14:textFill>
-            <w14:solidFill>
-              <w14:srgbClr w14:val="EE0000"/>
-            </w14:solidFill>
-          </w14:textFill>
-        </w:rPr>
       </w:pPr>
       <w:r>
         <w:rPr>
@@ -35,9 +23,8 @@
     </w:p>
     <w:tbl>
       <w:tblPr>
-        <w:bidiVisual w:val="on"/>
-        <w:tblW w:w="9335" w:type="dxa"/>
-        <w:jc w:val="center"/>
+        <w:tblW w:w="9340" w:type="dxa"/>
+        <w:jc w:val="left"/>
         <w:tblInd w:w="108" w:type="dxa"/>
         <w:tblBorders>
           <w:top w:val="single" w:color="ffffff" w:sz="8" w:space="0" w:shadow="0" w:frame="0"/>
@@ -51,57 +38,87 @@
         <w:tblLayout w:type="fixed"/>
       </w:tblPr>
       <w:tblGrid>
-        <w:gridCol w:w="4666"/>
-        <w:gridCol w:w="4669"/>
+        <w:gridCol w:w="4670"/>
+        <w:gridCol w:w="4670"/>
       </w:tblGrid>
       <w:tr>
         <w:tblPrEx>
-          <w:shd w:val="clear" w:color="auto" w:fill="cdd4e9"/>
+          <w:shd w:val="clear" w:color="auto" w:fill="4472c4"/>
         </w:tblPrEx>
         <w:trPr>
-          <w:trHeight w:val="308" w:hRule="atLeast"/>
+          <w:trHeight w:val="436" w:hRule="atLeast"/>
+          <w:tblHeader/>
         </w:trPr>
         <w:tc>
           <w:tcPr>
-            <w:tcW w:type="dxa" w:w="9335"/>
+            <w:tcW w:type="dxa" w:w="9340"/>
             <w:gridSpan w:val="2"/>
             <w:tcBorders>
-              <w:top w:val="single" w:color="4472c4" w:sz="4" w:space="0" w:shadow="0" w:frame="0"/>
-              <w:left w:val="single" w:color="4472c4" w:sz="4" w:space="0" w:shadow="0" w:frame="0"/>
-              <w:bottom w:val="single" w:color="8eaadb" w:sz="4" w:space="0" w:shadow="0" w:frame="0"/>
-              <w:right w:val="single" w:color="4472c4" w:sz="4" w:space="0" w:shadow="0" w:frame="0"/>
+              <w:top w:val="single" w:color="ffffff" w:sz="8" w:space="0" w:shadow="0" w:frame="0"/>
+              <w:left w:val="single" w:color="ffffff" w:sz="8" w:space="0" w:shadow="0" w:frame="0"/>
+              <w:bottom w:val="single" w:color="ffffff" w:sz="24" w:space="0" w:shadow="0" w:frame="0"/>
+              <w:right w:val="single" w:color="ffffff" w:sz="8" w:space="0" w:shadow="0" w:frame="0"/>
             </w:tcBorders>
             <w:shd w:val="clear" w:color="auto" w:fill="4472c4"/>
             <w:tcMar>
-              <w:top w:type="dxa" w:w="80"/>
-              <w:left w:type="dxa" w:w="80"/>
-              <w:bottom w:type="dxa" w:w="80"/>
-              <w:right w:type="dxa" w:w="80"/>
+              <w:top w:type="dxa" w:w="0"/>
+              <w:left w:type="dxa" w:w="0"/>
+              <w:bottom w:type="dxa" w:w="0"/>
+              <w:right w:type="dxa" w:w="0"/>
             </w:tcMar>
             <w:vAlign w:val="top"/>
           </w:tcPr>
           <w:p>
             <w:pPr>
-              <w:pStyle w:val="Body"/>
-              <w:bidi w:val="1"/>
+              <w:keepNext w:val="0"/>
+              <w:keepLines w:val="0"/>
+              <w:pageBreakBefore w:val="0"/>
+              <w:widowControl w:val="1"/>
+              <w:shd w:val="clear" w:color="auto" w:fill="auto"/>
+              <w:tabs>
+                <w:tab w:val="left" w:pos="1440"/>
+                <w:tab w:val="left" w:pos="2880"/>
+                <w:tab w:val="left" w:pos="4320"/>
+                <w:tab w:val="left" w:pos="5760"/>
+                <w:tab w:val="left" w:pos="7200"/>
+                <w:tab w:val="left" w:pos="8640"/>
+              </w:tabs>
+              <w:suppressAutoHyphens w:val="1"/>
+              <w:bidi w:val="0"/>
+              <w:spacing w:before="0" w:after="0" w:line="240" w:lineRule="auto"/>
               <w:ind w:left="0" w:right="0" w:firstLine="0"/>
               <w:jc w:val="center"/>
+              <w:outlineLvl w:val="0"/>
               <w:rPr>
-                <w:rtl w:val="1"/>
+                <w:rtl w:val="0"/>
               </w:rPr>
             </w:pPr>
             <w:r>
               <w:rPr>
-                <w:rFonts w:ascii="Carlito" w:hAnsi="Carlito"/>
+                <w:rFonts w:ascii="Calibri" w:cs="Arial Unicode MS" w:hAnsi="Calibri" w:eastAsia="Arial Unicode MS"/>
                 <w:b w:val="1"/>
                 <w:bCs w:val="1"/>
+                <w:i w:val="0"/>
+                <w:iCs w:val="0"/>
+                <w:caps w:val="0"/>
+                <w:smallCaps w:val="0"/>
+                <w:strike w:val="0"/>
+                <w:dstrike w:val="0"/>
                 <w:outline w:val="0"/>
                 <w:color w:val="ffffff"/>
-                <w:sz w:val="28"/>
-                <w:szCs w:val="28"/>
-                <w:u w:color="ffffff"/>
+                <w:spacing w:val="0"/>
+                <w:kern w:val="0"/>
+                <w:position w:val="0"/>
+                <w:sz w:val="36"/>
+                <w:szCs w:val="36"/>
+                <w:u w:val="none"/>
+                <w:shd w:val="nil" w:color="auto" w:fill="auto"/>
+                <w:vertAlign w:val="baseline"/>
                 <w:rtl w:val="0"/>
-                <w:lang w:val="en-US"/>
+                <w14:textOutline w14:w="12700" w14:cap="flat">
+                  <w14:noFill/>
+                  <w14:miter w14:lim="400000"/>
+                </w14:textOutline>
                 <w14:textFill>
                   <w14:solidFill>
                     <w14:srgbClr w14:val="FFFFFF"/>
@@ -118,733 +135,23 @@
           <w:shd w:val="clear" w:color="auto" w:fill="cdd4e9"/>
         </w:tblPrEx>
         <w:trPr>
-          <w:trHeight w:val="308" w:hRule="atLeast"/>
+          <w:trHeight w:val="436" w:hRule="atLeast"/>
         </w:trPr>
         <w:tc>
           <w:tcPr>
-            <w:tcW w:type="dxa" w:w="4666"/>
+            <w:tcW w:type="dxa" w:w="4670"/>
             <w:tcBorders>
-              <w:top w:val="single" w:color="8eaadb" w:sz="4" w:space="0" w:shadow="0" w:frame="0"/>
-              <w:left w:val="single" w:color="8eaadb" w:sz="4" w:space="0" w:shadow="0" w:frame="0"/>
-              <w:bottom w:val="single" w:color="8eaadb" w:sz="4" w:space="0" w:shadow="0" w:frame="0"/>
-              <w:right w:val="single" w:color="8eaadb" w:sz="4" w:space="0" w:shadow="0" w:frame="0"/>
+              <w:top w:val="single" w:color="ffffff" w:sz="24" w:space="0" w:shadow="0" w:frame="0"/>
+              <w:left w:val="single" w:color="ffffff" w:sz="8" w:space="0" w:shadow="0" w:frame="0"/>
+              <w:bottom w:val="single" w:color="ffffff" w:sz="8" w:space="0" w:shadow="0" w:frame="0"/>
+              <w:right w:val="single" w:color="ffffff" w:sz="8" w:space="0" w:shadow="0" w:frame="0"/>
             </w:tcBorders>
-            <w:shd w:val="clear" w:color="auto" w:fill="d9e2f3"/>
+            <w:shd w:val="clear" w:color="auto" w:fill="cdd4e9"/>
             <w:tcMar>
-              <w:top w:type="dxa" w:w="80"/>
-              <w:left w:type="dxa" w:w="80"/>
-              <w:bottom w:type="dxa" w:w="80"/>
-              <w:right w:type="dxa" w:w="80"/>
-            </w:tcMar>
-            <w:vAlign w:val="top"/>
-          </w:tcPr>
-          <w:p/>
-        </w:tc>
-        <w:tc>
-          <w:tcPr>
-            <w:tcW w:type="dxa" w:w="4669"/>
-            <w:tcBorders>
-              <w:top w:val="single" w:color="8eaadb" w:sz="4" w:space="0" w:shadow="0" w:frame="0"/>
-              <w:left w:val="single" w:color="8eaadb" w:sz="4" w:space="0" w:shadow="0" w:frame="0"/>
-              <w:bottom w:val="single" w:color="8eaadb" w:sz="4" w:space="0" w:shadow="0" w:frame="0"/>
-              <w:right w:val="single" w:color="8eaadb" w:sz="4" w:space="0" w:shadow="0" w:frame="0"/>
-            </w:tcBorders>
-            <w:shd w:val="clear" w:color="auto" w:fill="d9e2f3"/>
-            <w:tcMar>
-              <w:top w:type="dxa" w:w="80"/>
-              <w:left w:type="dxa" w:w="80"/>
-              <w:bottom w:type="dxa" w:w="80"/>
-              <w:right w:type="dxa" w:w="80"/>
-            </w:tcMar>
-            <w:vAlign w:val="top"/>
-          </w:tcPr>
-          <w:p>
-            <w:pPr>
-              <w:pStyle w:val="Body"/>
-              <w:bidi w:val="1"/>
-              <w:spacing w:after="0" w:line="240" w:lineRule="auto"/>
-              <w:ind w:left="0" w:right="0" w:firstLine="0"/>
-              <w:jc w:val="right"/>
-              <w:rPr>
-                <w:rtl w:val="1"/>
-              </w:rPr>
-            </w:pPr>
-            <w:r>
-              <w:rPr>
-                <w:rFonts w:ascii="Carlito" w:hAnsi="Carlito"/>
-                <w:sz w:val="28"/>
-                <w:szCs w:val="28"/>
-                <w:rtl w:val="0"/>
-                <w:lang w:val="en-US"/>
-              </w:rPr>
-              <w:t>Name of the task</w:t>
-            </w:r>
-          </w:p>
-        </w:tc>
-      </w:tr>
-      <w:tr>
-        <w:tblPrEx>
-          <w:shd w:val="clear" w:color="auto" w:fill="cdd4e9"/>
-        </w:tblPrEx>
-        <w:trPr>
-          <w:trHeight w:val="308" w:hRule="atLeast"/>
-        </w:trPr>
-        <w:tc>
-          <w:tcPr>
-            <w:tcW w:type="dxa" w:w="4666"/>
-            <w:tcBorders>
-              <w:top w:val="single" w:color="8eaadb" w:sz="4" w:space="0" w:shadow="0" w:frame="0"/>
-              <w:left w:val="single" w:color="8eaadb" w:sz="4" w:space="0" w:shadow="0" w:frame="0"/>
-              <w:bottom w:val="single" w:color="8eaadb" w:sz="4" w:space="0" w:shadow="0" w:frame="0"/>
-              <w:right w:val="single" w:color="8eaadb" w:sz="4" w:space="0" w:shadow="0" w:frame="0"/>
-            </w:tcBorders>
-            <w:shd w:val="clear" w:color="auto" w:fill="auto"/>
-            <w:tcMar>
-              <w:top w:type="dxa" w:w="80"/>
-              <w:left w:type="dxa" w:w="80"/>
-              <w:bottom w:type="dxa" w:w="80"/>
-              <w:right w:type="dxa" w:w="80"/>
-            </w:tcMar>
-            <w:vAlign w:val="top"/>
-          </w:tcPr>
-          <w:p/>
-        </w:tc>
-        <w:tc>
-          <w:tcPr>
-            <w:tcW w:type="dxa" w:w="4669"/>
-            <w:tcBorders>
-              <w:top w:val="single" w:color="8eaadb" w:sz="4" w:space="0" w:shadow="0" w:frame="0"/>
-              <w:left w:val="single" w:color="8eaadb" w:sz="4" w:space="0" w:shadow="0" w:frame="0"/>
-              <w:bottom w:val="single" w:color="8eaadb" w:sz="4" w:space="0" w:shadow="0" w:frame="0"/>
-              <w:right w:val="single" w:color="8eaadb" w:sz="4" w:space="0" w:shadow="0" w:frame="0"/>
-            </w:tcBorders>
-            <w:shd w:val="clear" w:color="auto" w:fill="auto"/>
-            <w:tcMar>
-              <w:top w:type="dxa" w:w="80"/>
-              <w:left w:type="dxa" w:w="80"/>
-              <w:bottom w:type="dxa" w:w="80"/>
-              <w:right w:type="dxa" w:w="80"/>
-            </w:tcMar>
-            <w:vAlign w:val="top"/>
-          </w:tcPr>
-          <w:p>
-            <w:pPr>
-              <w:pStyle w:val="Body"/>
-              <w:bidi w:val="1"/>
-              <w:spacing w:after="0" w:line="240" w:lineRule="auto"/>
-              <w:ind w:left="0" w:right="0" w:firstLine="0"/>
-              <w:jc w:val="right"/>
-              <w:rPr>
-                <w:rtl w:val="1"/>
-              </w:rPr>
-            </w:pPr>
-            <w:r>
-              <w:rPr>
-                <w:rFonts w:ascii="Carlito" w:hAnsi="Carlito"/>
-                <w:sz w:val="28"/>
-                <w:szCs w:val="28"/>
-                <w:rtl w:val="0"/>
-                <w:lang w:val="en-US"/>
-              </w:rPr>
-              <w:t>Start date</w:t>
-            </w:r>
-          </w:p>
-        </w:tc>
-      </w:tr>
-      <w:tr>
-        <w:tblPrEx>
-          <w:shd w:val="clear" w:color="auto" w:fill="cdd4e9"/>
-        </w:tblPrEx>
-        <w:trPr>
-          <w:trHeight w:val="308" w:hRule="atLeast"/>
-        </w:trPr>
-        <w:tc>
-          <w:tcPr>
-            <w:tcW w:type="dxa" w:w="4666"/>
-            <w:tcBorders>
-              <w:top w:val="single" w:color="8eaadb" w:sz="4" w:space="0" w:shadow="0" w:frame="0"/>
-              <w:left w:val="single" w:color="8eaadb" w:sz="4" w:space="0" w:shadow="0" w:frame="0"/>
-              <w:bottom w:val="single" w:color="8eaadb" w:sz="4" w:space="0" w:shadow="0" w:frame="0"/>
-              <w:right w:val="single" w:color="8eaadb" w:sz="4" w:space="0" w:shadow="0" w:frame="0"/>
-            </w:tcBorders>
-            <w:shd w:val="clear" w:color="auto" w:fill="d9e2f3"/>
-            <w:tcMar>
-              <w:top w:type="dxa" w:w="80"/>
-              <w:left w:type="dxa" w:w="80"/>
-              <w:bottom w:type="dxa" w:w="80"/>
-              <w:right w:type="dxa" w:w="80"/>
-            </w:tcMar>
-            <w:vAlign w:val="top"/>
-          </w:tcPr>
-          <w:p/>
-        </w:tc>
-        <w:tc>
-          <w:tcPr>
-            <w:tcW w:type="dxa" w:w="4669"/>
-            <w:tcBorders>
-              <w:top w:val="single" w:color="8eaadb" w:sz="4" w:space="0" w:shadow="0" w:frame="0"/>
-              <w:left w:val="single" w:color="8eaadb" w:sz="4" w:space="0" w:shadow="0" w:frame="0"/>
-              <w:bottom w:val="single" w:color="8eaadb" w:sz="4" w:space="0" w:shadow="0" w:frame="0"/>
-              <w:right w:val="single" w:color="8eaadb" w:sz="4" w:space="0" w:shadow="0" w:frame="0"/>
-            </w:tcBorders>
-            <w:shd w:val="clear" w:color="auto" w:fill="d9e2f3"/>
-            <w:tcMar>
-              <w:top w:type="dxa" w:w="80"/>
-              <w:left w:type="dxa" w:w="80"/>
-              <w:bottom w:type="dxa" w:w="80"/>
-              <w:right w:type="dxa" w:w="80"/>
-            </w:tcMar>
-            <w:vAlign w:val="top"/>
-          </w:tcPr>
-          <w:p>
-            <w:pPr>
-              <w:pStyle w:val="Body"/>
-              <w:bidi w:val="1"/>
-              <w:spacing w:after="0" w:line="240" w:lineRule="auto"/>
-              <w:ind w:left="0" w:right="0" w:firstLine="0"/>
-              <w:jc w:val="right"/>
-              <w:rPr>
-                <w:rtl w:val="1"/>
-              </w:rPr>
-            </w:pPr>
-            <w:r>
-              <w:rPr>
-                <w:rFonts w:ascii="Carlito" w:hAnsi="Carlito"/>
-                <w:sz w:val="28"/>
-                <w:szCs w:val="28"/>
-                <w:rtl w:val="0"/>
-                <w:lang w:val="en-US"/>
-              </w:rPr>
-              <w:t>Completion date</w:t>
-            </w:r>
-          </w:p>
-        </w:tc>
-      </w:tr>
-      <w:tr>
-        <w:tblPrEx>
-          <w:shd w:val="clear" w:color="auto" w:fill="cdd4e9"/>
-        </w:tblPrEx>
-        <w:trPr>
-          <w:trHeight w:val="308" w:hRule="atLeast"/>
-        </w:trPr>
-        <w:tc>
-          <w:tcPr>
-            <w:tcW w:type="dxa" w:w="4666"/>
-            <w:tcBorders>
-              <w:top w:val="single" w:color="8eaadb" w:sz="4" w:space="0" w:shadow="0" w:frame="0"/>
-              <w:left w:val="single" w:color="8eaadb" w:sz="4" w:space="0" w:shadow="0" w:frame="0"/>
-              <w:bottom w:val="single" w:color="8eaadb" w:sz="4" w:space="0" w:shadow="0" w:frame="0"/>
-              <w:right w:val="single" w:color="8eaadb" w:sz="4" w:space="0" w:shadow="0" w:frame="0"/>
-            </w:tcBorders>
-            <w:shd w:val="clear" w:color="auto" w:fill="auto"/>
-            <w:tcMar>
-              <w:top w:type="dxa" w:w="80"/>
-              <w:left w:type="dxa" w:w="80"/>
-              <w:bottom w:type="dxa" w:w="80"/>
-              <w:right w:type="dxa" w:w="80"/>
-            </w:tcMar>
-            <w:vAlign w:val="top"/>
-          </w:tcPr>
-          <w:p/>
-        </w:tc>
-        <w:tc>
-          <w:tcPr>
-            <w:tcW w:type="dxa" w:w="4669"/>
-            <w:tcBorders>
-              <w:top w:val="single" w:color="8eaadb" w:sz="4" w:space="0" w:shadow="0" w:frame="0"/>
-              <w:left w:val="single" w:color="8eaadb" w:sz="4" w:space="0" w:shadow="0" w:frame="0"/>
-              <w:bottom w:val="single" w:color="8eaadb" w:sz="4" w:space="0" w:shadow="0" w:frame="0"/>
-              <w:right w:val="single" w:color="8eaadb" w:sz="4" w:space="0" w:shadow="0" w:frame="0"/>
-            </w:tcBorders>
-            <w:shd w:val="clear" w:color="auto" w:fill="auto"/>
-            <w:tcMar>
-              <w:top w:type="dxa" w:w="80"/>
-              <w:left w:type="dxa" w:w="80"/>
-              <w:bottom w:type="dxa" w:w="80"/>
-              <w:right w:type="dxa" w:w="80"/>
-            </w:tcMar>
-            <w:vAlign w:val="top"/>
-          </w:tcPr>
-          <w:p>
-            <w:pPr>
-              <w:pStyle w:val="Body"/>
-              <w:bidi w:val="1"/>
-              <w:spacing w:after="0" w:line="240" w:lineRule="auto"/>
-              <w:ind w:left="0" w:right="0" w:firstLine="0"/>
-              <w:jc w:val="right"/>
-              <w:rPr>
-                <w:rtl w:val="1"/>
-              </w:rPr>
-            </w:pPr>
-            <w:r>
-              <w:rPr>
-                <w:rFonts w:ascii="Carlito" w:hAnsi="Carlito"/>
-                <w:sz w:val="28"/>
-                <w:szCs w:val="28"/>
-                <w:rtl w:val="0"/>
-                <w:lang w:val="en-US"/>
-              </w:rPr>
-              <w:t>Person assigned to the task</w:t>
-            </w:r>
-          </w:p>
-        </w:tc>
-      </w:tr>
-      <w:tr>
-        <w:tblPrEx>
-          <w:shd w:val="clear" w:color="auto" w:fill="cdd4e9"/>
-        </w:tblPrEx>
-        <w:trPr>
-          <w:trHeight w:val="308" w:hRule="atLeast"/>
-        </w:trPr>
-        <w:tc>
-          <w:tcPr>
-            <w:tcW w:type="dxa" w:w="4666"/>
-            <w:tcBorders>
-              <w:top w:val="single" w:color="8eaadb" w:sz="4" w:space="0" w:shadow="0" w:frame="0"/>
-              <w:left w:val="single" w:color="8eaadb" w:sz="4" w:space="0" w:shadow="0" w:frame="0"/>
-              <w:bottom w:val="single" w:color="8eaadb" w:sz="4" w:space="0" w:shadow="0" w:frame="0"/>
-              <w:right w:val="single" w:color="8eaadb" w:sz="4" w:space="0" w:shadow="0" w:frame="0"/>
-            </w:tcBorders>
-            <w:shd w:val="clear" w:color="auto" w:fill="d9e2f3"/>
-            <w:tcMar>
-              <w:top w:type="dxa" w:w="80"/>
-              <w:left w:type="dxa" w:w="80"/>
-              <w:bottom w:type="dxa" w:w="80"/>
-              <w:right w:type="dxa" w:w="80"/>
-            </w:tcMar>
-            <w:vAlign w:val="top"/>
-          </w:tcPr>
-          <w:p/>
-        </w:tc>
-        <w:tc>
-          <w:tcPr>
-            <w:tcW w:type="dxa" w:w="4669"/>
-            <w:tcBorders>
-              <w:top w:val="single" w:color="8eaadb" w:sz="4" w:space="0" w:shadow="0" w:frame="0"/>
-              <w:left w:val="single" w:color="8eaadb" w:sz="4" w:space="0" w:shadow="0" w:frame="0"/>
-              <w:bottom w:val="single" w:color="8eaadb" w:sz="4" w:space="0" w:shadow="0" w:frame="0"/>
-              <w:right w:val="single" w:color="8eaadb" w:sz="4" w:space="0" w:shadow="0" w:frame="0"/>
-            </w:tcBorders>
-            <w:shd w:val="clear" w:color="auto" w:fill="d9e2f3"/>
-            <w:tcMar>
-              <w:top w:type="dxa" w:w="80"/>
-              <w:left w:type="dxa" w:w="80"/>
-              <w:bottom w:type="dxa" w:w="80"/>
-              <w:right w:type="dxa" w:w="80"/>
-            </w:tcMar>
-            <w:vAlign w:val="top"/>
-          </w:tcPr>
-          <w:p>
-            <w:pPr>
-              <w:pStyle w:val="Body"/>
-              <w:bidi w:val="1"/>
-              <w:spacing w:after="0" w:line="240" w:lineRule="auto"/>
-              <w:ind w:left="0" w:right="0" w:firstLine="0"/>
-              <w:jc w:val="right"/>
-              <w:rPr>
-                <w:rtl w:val="1"/>
-              </w:rPr>
-            </w:pPr>
-            <w:r>
-              <w:rPr>
-                <w:rFonts w:ascii="Carlito" w:hAnsi="Carlito"/>
-                <w:sz w:val="28"/>
-                <w:szCs w:val="28"/>
-                <w:rtl w:val="0"/>
-                <w:lang w:val="en-US"/>
-              </w:rPr>
-              <w:t>Deliverable(s)</w:t>
-            </w:r>
-          </w:p>
-        </w:tc>
-      </w:tr>
-      <w:tr>
-        <w:tblPrEx>
-          <w:shd w:val="clear" w:color="auto" w:fill="cdd4e9"/>
-        </w:tblPrEx>
-        <w:trPr>
-          <w:trHeight w:val="308" w:hRule="atLeast"/>
-        </w:trPr>
-        <w:tc>
-          <w:tcPr>
-            <w:tcW w:type="dxa" w:w="4666"/>
-            <w:tcBorders>
-              <w:top w:val="single" w:color="8eaadb" w:sz="4" w:space="0" w:shadow="0" w:frame="0"/>
-              <w:left w:val="single" w:color="8eaadb" w:sz="4" w:space="0" w:shadow="0" w:frame="0"/>
-              <w:bottom w:val="single" w:color="8eaadb" w:sz="4" w:space="0" w:shadow="0" w:frame="0"/>
-              <w:right w:val="single" w:color="8eaadb" w:sz="4" w:space="0" w:shadow="0" w:frame="0"/>
-            </w:tcBorders>
-            <w:shd w:val="clear" w:color="auto" w:fill="auto"/>
-            <w:tcMar>
-              <w:top w:type="dxa" w:w="80"/>
-              <w:left w:type="dxa" w:w="80"/>
-              <w:bottom w:type="dxa" w:w="80"/>
-              <w:right w:type="dxa" w:w="80"/>
-            </w:tcMar>
-            <w:vAlign w:val="top"/>
-          </w:tcPr>
-          <w:p/>
-        </w:tc>
-        <w:tc>
-          <w:tcPr>
-            <w:tcW w:type="dxa" w:w="4669"/>
-            <w:tcBorders>
-              <w:top w:val="single" w:color="8eaadb" w:sz="4" w:space="0" w:shadow="0" w:frame="0"/>
-              <w:left w:val="single" w:color="8eaadb" w:sz="4" w:space="0" w:shadow="0" w:frame="0"/>
-              <w:bottom w:val="single" w:color="8eaadb" w:sz="4" w:space="0" w:shadow="0" w:frame="0"/>
-              <w:right w:val="single" w:color="8eaadb" w:sz="4" w:space="0" w:shadow="0" w:frame="0"/>
-            </w:tcBorders>
-            <w:shd w:val="clear" w:color="auto" w:fill="auto"/>
-            <w:tcMar>
-              <w:top w:type="dxa" w:w="80"/>
-              <w:left w:type="dxa" w:w="80"/>
-              <w:bottom w:type="dxa" w:w="80"/>
-              <w:right w:type="dxa" w:w="80"/>
-            </w:tcMar>
-            <w:vAlign w:val="top"/>
-          </w:tcPr>
-          <w:p>
-            <w:pPr>
-              <w:pStyle w:val="Body"/>
-              <w:bidi w:val="1"/>
-              <w:spacing w:after="0" w:line="240" w:lineRule="auto"/>
-              <w:ind w:left="0" w:right="0" w:firstLine="0"/>
-              <w:jc w:val="right"/>
-              <w:rPr>
-                <w:rtl w:val="1"/>
-              </w:rPr>
-            </w:pPr>
-            <w:r>
-              <w:rPr>
-                <w:rFonts w:ascii="Carlito" w:hAnsi="Carlito"/>
-                <w:sz w:val="28"/>
-                <w:szCs w:val="28"/>
-                <w:rtl w:val="0"/>
-                <w:lang w:val="en-US"/>
-              </w:rPr>
-              <w:t>Completion status</w:t>
-            </w:r>
-          </w:p>
-        </w:tc>
-      </w:tr>
-      <w:tr>
-        <w:tblPrEx>
-          <w:shd w:val="clear" w:color="auto" w:fill="cdd4e9"/>
-        </w:tblPrEx>
-        <w:trPr>
-          <w:trHeight w:val="308" w:hRule="atLeast"/>
-        </w:trPr>
-        <w:tc>
-          <w:tcPr>
-            <w:tcW w:type="dxa" w:w="4666"/>
-            <w:tcBorders>
-              <w:top w:val="single" w:color="8eaadb" w:sz="4" w:space="0" w:shadow="0" w:frame="0"/>
-              <w:left w:val="single" w:color="8eaadb" w:sz="4" w:space="0" w:shadow="0" w:frame="0"/>
-              <w:bottom w:val="single" w:color="8eaadb" w:sz="4" w:space="0" w:shadow="0" w:frame="0"/>
-              <w:right w:val="single" w:color="8eaadb" w:sz="4" w:space="0" w:shadow="0" w:frame="0"/>
-            </w:tcBorders>
-            <w:shd w:val="clear" w:color="auto" w:fill="d9e2f3"/>
-            <w:tcMar>
-              <w:top w:type="dxa" w:w="80"/>
-              <w:left w:type="dxa" w:w="80"/>
-              <w:bottom w:type="dxa" w:w="80"/>
-              <w:right w:type="dxa" w:w="80"/>
-            </w:tcMar>
-            <w:vAlign w:val="top"/>
-          </w:tcPr>
-          <w:p/>
-        </w:tc>
-        <w:tc>
-          <w:tcPr>
-            <w:tcW w:type="dxa" w:w="4669"/>
-            <w:tcBorders>
-              <w:top w:val="single" w:color="8eaadb" w:sz="4" w:space="0" w:shadow="0" w:frame="0"/>
-              <w:left w:val="single" w:color="8eaadb" w:sz="4" w:space="0" w:shadow="0" w:frame="0"/>
-              <w:bottom w:val="single" w:color="8eaadb" w:sz="4" w:space="0" w:shadow="0" w:frame="0"/>
-              <w:right w:val="single" w:color="8eaadb" w:sz="4" w:space="0" w:shadow="0" w:frame="0"/>
-            </w:tcBorders>
-            <w:shd w:val="clear" w:color="auto" w:fill="d9e2f3"/>
-            <w:tcMar>
-              <w:top w:type="dxa" w:w="80"/>
-              <w:left w:type="dxa" w:w="80"/>
-              <w:bottom w:type="dxa" w:w="80"/>
-              <w:right w:type="dxa" w:w="80"/>
-            </w:tcMar>
-            <w:vAlign w:val="top"/>
-          </w:tcPr>
-          <w:p>
-            <w:pPr>
-              <w:pStyle w:val="Body"/>
-              <w:bidi w:val="1"/>
-              <w:spacing w:after="0" w:line="240" w:lineRule="auto"/>
-              <w:ind w:left="0" w:right="0" w:firstLine="0"/>
-              <w:jc w:val="right"/>
-              <w:rPr>
-                <w:rtl w:val="1"/>
-              </w:rPr>
-            </w:pPr>
-            <w:r>
-              <w:rPr>
-                <w:rFonts w:ascii="Carlito" w:hAnsi="Carlito"/>
-                <w:sz w:val="28"/>
-                <w:szCs w:val="28"/>
-                <w:rtl w:val="0"/>
-                <w:lang w:val="en-US"/>
-              </w:rPr>
-              <w:t>Priority*</w:t>
-            </w:r>
-          </w:p>
-        </w:tc>
-      </w:tr>
-      <w:tr>
-        <w:tblPrEx>
-          <w:shd w:val="clear" w:color="auto" w:fill="cdd4e9"/>
-        </w:tblPrEx>
-        <w:trPr>
-          <w:trHeight w:val="308" w:hRule="atLeast"/>
-        </w:trPr>
-        <w:tc>
-          <w:tcPr>
-            <w:tcW w:type="dxa" w:w="4666"/>
-            <w:tcBorders>
-              <w:top w:val="single" w:color="8eaadb" w:sz="4" w:space="0" w:shadow="0" w:frame="0"/>
-              <w:left w:val="single" w:color="8eaadb" w:sz="4" w:space="0" w:shadow="0" w:frame="0"/>
-              <w:bottom w:val="single" w:color="8eaadb" w:sz="4" w:space="0" w:shadow="0" w:frame="0"/>
-              <w:right w:val="single" w:color="8eaadb" w:sz="4" w:space="0" w:shadow="0" w:frame="0"/>
-            </w:tcBorders>
-            <w:shd w:val="clear" w:color="auto" w:fill="auto"/>
-            <w:tcMar>
-              <w:top w:type="dxa" w:w="80"/>
-              <w:left w:type="dxa" w:w="80"/>
-              <w:bottom w:type="dxa" w:w="80"/>
-              <w:right w:type="dxa" w:w="80"/>
-            </w:tcMar>
-            <w:vAlign w:val="top"/>
-          </w:tcPr>
-          <w:p/>
-        </w:tc>
-        <w:tc>
-          <w:tcPr>
-            <w:tcW w:type="dxa" w:w="4669"/>
-            <w:tcBorders>
-              <w:top w:val="single" w:color="8eaadb" w:sz="4" w:space="0" w:shadow="0" w:frame="0"/>
-              <w:left w:val="single" w:color="8eaadb" w:sz="4" w:space="0" w:shadow="0" w:frame="0"/>
-              <w:bottom w:val="single" w:color="8eaadb" w:sz="4" w:space="0" w:shadow="0" w:frame="0"/>
-              <w:right w:val="single" w:color="8eaadb" w:sz="4" w:space="0" w:shadow="0" w:frame="0"/>
-            </w:tcBorders>
-            <w:shd w:val="clear" w:color="auto" w:fill="auto"/>
-            <w:tcMar>
-              <w:top w:type="dxa" w:w="80"/>
-              <w:left w:type="dxa" w:w="80"/>
-              <w:bottom w:type="dxa" w:w="80"/>
-              <w:right w:type="dxa" w:w="80"/>
-            </w:tcMar>
-            <w:vAlign w:val="top"/>
-          </w:tcPr>
-          <w:p>
-            <w:pPr>
-              <w:pStyle w:val="Body"/>
-              <w:bidi w:val="1"/>
-              <w:spacing w:after="0" w:line="240" w:lineRule="auto"/>
-              <w:ind w:left="0" w:right="0" w:firstLine="0"/>
-              <w:jc w:val="right"/>
-              <w:rPr>
-                <w:rtl w:val="1"/>
-              </w:rPr>
-            </w:pPr>
-            <w:r>
-              <w:rPr>
-                <w:rFonts w:ascii="Carlito" w:hAnsi="Carlito"/>
-                <w:sz w:val="28"/>
-                <w:szCs w:val="28"/>
-                <w:rtl w:val="0"/>
-                <w:lang w:val="en-US"/>
-              </w:rPr>
-              <w:t>Resources that are needed</w:t>
-            </w:r>
-          </w:p>
-        </w:tc>
-      </w:tr>
-      <w:tr>
-        <w:tblPrEx>
-          <w:shd w:val="clear" w:color="auto" w:fill="cdd4e9"/>
-        </w:tblPrEx>
-        <w:trPr>
-          <w:trHeight w:val="308" w:hRule="atLeast"/>
-        </w:trPr>
-        <w:tc>
-          <w:tcPr>
-            <w:tcW w:type="dxa" w:w="4666"/>
-            <w:tcBorders>
-              <w:top w:val="single" w:color="8eaadb" w:sz="4" w:space="0" w:shadow="0" w:frame="0"/>
-              <w:left w:val="single" w:color="8eaadb" w:sz="4" w:space="0" w:shadow="0" w:frame="0"/>
-              <w:bottom w:val="single" w:color="8eaadb" w:sz="4" w:space="0" w:shadow="0" w:frame="0"/>
-              <w:right w:val="single" w:color="8eaadb" w:sz="4" w:space="0" w:shadow="0" w:frame="0"/>
-            </w:tcBorders>
-            <w:shd w:val="clear" w:color="auto" w:fill="d9e2f3"/>
-            <w:tcMar>
-              <w:top w:type="dxa" w:w="80"/>
-              <w:left w:type="dxa" w:w="80"/>
-              <w:bottom w:type="dxa" w:w="80"/>
-              <w:right w:type="dxa" w:w="80"/>
-            </w:tcMar>
-            <w:vAlign w:val="top"/>
-          </w:tcPr>
-          <w:p/>
-        </w:tc>
-        <w:tc>
-          <w:tcPr>
-            <w:tcW w:type="dxa" w:w="4669"/>
-            <w:tcBorders>
-              <w:top w:val="single" w:color="8eaadb" w:sz="4" w:space="0" w:shadow="0" w:frame="0"/>
-              <w:left w:val="single" w:color="8eaadb" w:sz="4" w:space="0" w:shadow="0" w:frame="0"/>
-              <w:bottom w:val="single" w:color="8eaadb" w:sz="4" w:space="0" w:shadow="0" w:frame="0"/>
-              <w:right w:val="single" w:color="8eaadb" w:sz="4" w:space="0" w:shadow="0" w:frame="0"/>
-            </w:tcBorders>
-            <w:shd w:val="clear" w:color="auto" w:fill="d9e2f3"/>
-            <w:tcMar>
-              <w:top w:type="dxa" w:w="80"/>
-              <w:left w:type="dxa" w:w="80"/>
-              <w:bottom w:type="dxa" w:w="80"/>
-              <w:right w:type="dxa" w:w="80"/>
-            </w:tcMar>
-            <w:vAlign w:val="top"/>
-          </w:tcPr>
-          <w:p>
-            <w:pPr>
-              <w:pStyle w:val="Body"/>
-              <w:bidi w:val="1"/>
-              <w:spacing w:after="0" w:line="240" w:lineRule="auto"/>
-              <w:ind w:left="0" w:right="0" w:firstLine="0"/>
-              <w:jc w:val="right"/>
-              <w:rPr>
-                <w:rtl w:val="1"/>
-              </w:rPr>
-            </w:pPr>
-            <w:r>
-              <w:rPr>
-                <w:rFonts w:ascii="Carlito" w:hAnsi="Carlito"/>
-                <w:sz w:val="28"/>
-                <w:szCs w:val="28"/>
-                <w:rtl w:val="0"/>
-                <w:lang w:val="en-US"/>
-              </w:rPr>
-              <w:t>Estimated time</w:t>
-            </w:r>
-          </w:p>
-        </w:tc>
-      </w:tr>
-      <w:tr>
-        <w:tblPrEx>
-          <w:shd w:val="clear" w:color="auto" w:fill="cdd4e9"/>
-        </w:tblPrEx>
-        <w:trPr>
-          <w:trHeight w:val="308" w:hRule="atLeast"/>
-        </w:trPr>
-        <w:tc>
-          <w:tcPr>
-            <w:tcW w:type="dxa" w:w="4666"/>
-            <w:tcBorders>
-              <w:top w:val="single" w:color="8eaadb" w:sz="4" w:space="0" w:shadow="0" w:frame="0"/>
-              <w:left w:val="single" w:color="8eaadb" w:sz="4" w:space="0" w:shadow="0" w:frame="0"/>
-              <w:bottom w:val="single" w:color="8eaadb" w:sz="4" w:space="0" w:shadow="0" w:frame="0"/>
-              <w:right w:val="single" w:color="8eaadb" w:sz="4" w:space="0" w:shadow="0" w:frame="0"/>
-            </w:tcBorders>
-            <w:shd w:val="clear" w:color="auto" w:fill="auto"/>
-            <w:tcMar>
-              <w:top w:type="dxa" w:w="80"/>
-              <w:left w:type="dxa" w:w="80"/>
-              <w:bottom w:type="dxa" w:w="80"/>
-              <w:right w:type="dxa" w:w="80"/>
-            </w:tcMar>
-            <w:vAlign w:val="top"/>
-          </w:tcPr>
-          <w:p/>
-        </w:tc>
-        <w:tc>
-          <w:tcPr>
-            <w:tcW w:type="dxa" w:w="4669"/>
-            <w:tcBorders>
-              <w:top w:val="single" w:color="8eaadb" w:sz="4" w:space="0" w:shadow="0" w:frame="0"/>
-              <w:left w:val="single" w:color="8eaadb" w:sz="4" w:space="0" w:shadow="0" w:frame="0"/>
-              <w:bottom w:val="single" w:color="8eaadb" w:sz="4" w:space="0" w:shadow="0" w:frame="0"/>
-              <w:right w:val="single" w:color="8eaadb" w:sz="4" w:space="0" w:shadow="0" w:frame="0"/>
-            </w:tcBorders>
-            <w:shd w:val="clear" w:color="auto" w:fill="auto"/>
-            <w:tcMar>
-              <w:top w:type="dxa" w:w="80"/>
-              <w:left w:type="dxa" w:w="80"/>
-              <w:bottom w:type="dxa" w:w="80"/>
-              <w:right w:type="dxa" w:w="80"/>
-            </w:tcMar>
-            <w:vAlign w:val="top"/>
-          </w:tcPr>
-          <w:p>
-            <w:pPr>
-              <w:pStyle w:val="Body"/>
-              <w:bidi w:val="1"/>
-              <w:spacing w:after="0" w:line="240" w:lineRule="auto"/>
-              <w:ind w:left="0" w:right="0" w:firstLine="0"/>
-              <w:jc w:val="right"/>
-              <w:rPr>
-                <w:rtl w:val="1"/>
-              </w:rPr>
-            </w:pPr>
-            <w:r>
-              <w:rPr>
-                <w:rFonts w:ascii="Carlito" w:hAnsi="Carlito"/>
-                <w:sz w:val="28"/>
-                <w:szCs w:val="28"/>
-                <w:rtl w:val="0"/>
-                <w:lang w:val="en-US"/>
-              </w:rPr>
-              <w:t>Actual time</w:t>
-            </w:r>
-          </w:p>
-        </w:tc>
-      </w:tr>
-      <w:tr>
-        <w:tblPrEx>
-          <w:shd w:val="clear" w:color="auto" w:fill="cdd4e9"/>
-        </w:tblPrEx>
-        <w:trPr>
-          <w:trHeight w:val="308" w:hRule="atLeast"/>
-        </w:trPr>
-        <w:tc>
-          <w:tcPr>
-            <w:tcW w:type="dxa" w:w="4666"/>
-            <w:tcBorders>
-              <w:top w:val="single" w:color="8eaadb" w:sz="4" w:space="0" w:shadow="0" w:frame="0"/>
-              <w:left w:val="single" w:color="8eaadb" w:sz="4" w:space="0" w:shadow="0" w:frame="0"/>
-              <w:bottom w:val="single" w:color="8eaadb" w:sz="4" w:space="0" w:shadow="0" w:frame="0"/>
-              <w:right w:val="single" w:color="8eaadb" w:sz="4" w:space="0" w:shadow="0" w:frame="0"/>
-            </w:tcBorders>
-            <w:shd w:val="clear" w:color="auto" w:fill="auto"/>
-            <w:tcMar>
-              <w:top w:type="dxa" w:w="80"/>
-              <w:left w:type="dxa" w:w="80"/>
-              <w:bottom w:type="dxa" w:w="80"/>
-              <w:right w:type="dxa" w:w="80"/>
-            </w:tcMar>
-            <w:vAlign w:val="top"/>
-          </w:tcPr>
-          <w:p/>
-        </w:tc>
-        <w:tc>
-          <w:tcPr>
-            <w:tcW w:type="dxa" w:w="4669"/>
-            <w:tcBorders>
-              <w:top w:val="single" w:color="8eaadb" w:sz="4" w:space="0" w:shadow="0" w:frame="0"/>
-              <w:left w:val="single" w:color="8eaadb" w:sz="4" w:space="0" w:shadow="0" w:frame="0"/>
-              <w:bottom w:val="single" w:color="8eaadb" w:sz="4" w:space="0" w:shadow="0" w:frame="0"/>
-              <w:right w:val="single" w:color="8eaadb" w:sz="4" w:space="0" w:shadow="0" w:frame="0"/>
-            </w:tcBorders>
-            <w:shd w:val="clear" w:color="auto" w:fill="auto"/>
-            <w:tcMar>
-              <w:top w:type="dxa" w:w="80"/>
-              <w:left w:type="dxa" w:w="80"/>
-              <w:bottom w:type="dxa" w:w="80"/>
-              <w:right w:type="dxa" w:w="80"/>
+              <w:top w:type="dxa" w:w="0"/>
+              <w:left w:type="dxa" w:w="0"/>
+              <w:bottom w:type="dxa" w:w="0"/>
+              <w:right w:type="dxa" w:w="0"/>
             </w:tcMar>
             <w:vAlign w:val="top"/>
           </w:tcPr>
@@ -855,19 +162,19 @@
               <w:pageBreakBefore w:val="0"/>
               <w:widowControl w:val="1"/>
               <w:shd w:val="clear" w:color="auto" w:fill="auto"/>
-              <w:suppressAutoHyphens w:val="0"/>
+              <w:suppressAutoHyphens w:val="1"/>
               <w:bidi w:val="0"/>
               <w:spacing w:before="0" w:after="0" w:line="240" w:lineRule="auto"/>
               <w:ind w:left="0" w:right="0" w:firstLine="0"/>
               <w:jc w:val="left"/>
-              <w:outlineLvl w:val="9"/>
+              <w:outlineLvl w:val="0"/>
               <w:rPr>
                 <w:rtl w:val="0"/>
               </w:rPr>
             </w:pPr>
             <w:r>
               <w:rPr>
-                <w:rFonts w:ascii="Carlito" w:cs="Arial Unicode MS" w:hAnsi="Carlito" w:eastAsia="Arial Unicode MS"/>
+                <w:rFonts w:ascii="Calibri" w:cs="Arial Unicode MS" w:hAnsi="Calibri" w:eastAsia="Arial Unicode MS"/>
                 <w:b w:val="0"/>
                 <w:bCs w:val="0"/>
                 <w:i w:val="0"/>
@@ -879,16 +186,1007 @@
                 <w:outline w:val="0"/>
                 <w:color w:val="000000"/>
                 <w:spacing w:val="0"/>
-                <w:kern w:val="2"/>
+                <w:kern w:val="0"/>
                 <w:position w:val="0"/>
-                <w:sz w:val="28"/>
-                <w:szCs w:val="28"/>
-                <w:u w:val="none" w:color="000000"/>
+                <w:sz w:val="36"/>
+                <w:szCs w:val="36"/>
+                <w:u w:val="none"/>
                 <w:shd w:val="nil" w:color="auto" w:fill="auto"/>
                 <w:vertAlign w:val="baseline"/>
                 <w:rtl w:val="0"/>
-                <w14:textOutline>
+                <w14:textOutline w14:w="12700" w14:cap="flat">
                   <w14:noFill/>
+                  <w14:miter w14:lim="400000"/>
+                </w14:textOutline>
+                <w14:textFill>
+                  <w14:solidFill>
+                    <w14:srgbClr w14:val="000000"/>
+                  </w14:solidFill>
+                </w14:textFill>
+              </w:rPr>
+              <w:t>Name of the task</w:t>
+            </w:r>
+          </w:p>
+        </w:tc>
+        <w:tc>
+          <w:tcPr>
+            <w:tcW w:type="dxa" w:w="4670"/>
+            <w:tcBorders>
+              <w:top w:val="single" w:color="ffffff" w:sz="24" w:space="0" w:shadow="0" w:frame="0"/>
+              <w:left w:val="single" w:color="ffffff" w:sz="8" w:space="0" w:shadow="0" w:frame="0"/>
+              <w:bottom w:val="single" w:color="ffffff" w:sz="8" w:space="0" w:shadow="0" w:frame="0"/>
+              <w:right w:val="single" w:color="ffffff" w:sz="8" w:space="0" w:shadow="0" w:frame="0"/>
+            </w:tcBorders>
+            <w:shd w:val="clear" w:color="auto" w:fill="cdd4e9"/>
+            <w:tcMar>
+              <w:top w:type="dxa" w:w="0"/>
+              <w:left w:type="dxa" w:w="0"/>
+              <w:bottom w:type="dxa" w:w="0"/>
+              <w:right w:type="dxa" w:w="0"/>
+            </w:tcMar>
+            <w:vAlign w:val="top"/>
+          </w:tcPr>
+          <w:p/>
+        </w:tc>
+      </w:tr>
+      <w:tr>
+        <w:tblPrEx>
+          <w:shd w:val="clear" w:color="auto" w:fill="cdd4e9"/>
+        </w:tblPrEx>
+        <w:trPr>
+          <w:trHeight w:val="436" w:hRule="atLeast"/>
+        </w:trPr>
+        <w:tc>
+          <w:tcPr>
+            <w:tcW w:type="dxa" w:w="4670"/>
+            <w:tcBorders>
+              <w:top w:val="single" w:color="ffffff" w:sz="8" w:space="0" w:shadow="0" w:frame="0"/>
+              <w:left w:val="single" w:color="ffffff" w:sz="8" w:space="0" w:shadow="0" w:frame="0"/>
+              <w:bottom w:val="single" w:color="ffffff" w:sz="8" w:space="0" w:shadow="0" w:frame="0"/>
+              <w:right w:val="single" w:color="ffffff" w:sz="8" w:space="0" w:shadow="0" w:frame="0"/>
+            </w:tcBorders>
+            <w:shd w:val="clear" w:color="auto" w:fill="e7eaf4"/>
+            <w:tcMar>
+              <w:top w:type="dxa" w:w="0"/>
+              <w:left w:type="dxa" w:w="0"/>
+              <w:bottom w:type="dxa" w:w="0"/>
+              <w:right w:type="dxa" w:w="0"/>
+            </w:tcMar>
+            <w:vAlign w:val="top"/>
+          </w:tcPr>
+          <w:p>
+            <w:pPr>
+              <w:keepNext w:val="0"/>
+              <w:keepLines w:val="0"/>
+              <w:pageBreakBefore w:val="0"/>
+              <w:widowControl w:val="1"/>
+              <w:shd w:val="clear" w:color="auto" w:fill="auto"/>
+              <w:suppressAutoHyphens w:val="1"/>
+              <w:bidi w:val="0"/>
+              <w:spacing w:before="0" w:after="0" w:line="240" w:lineRule="auto"/>
+              <w:ind w:left="0" w:right="0" w:firstLine="0"/>
+              <w:jc w:val="left"/>
+              <w:outlineLvl w:val="0"/>
+              <w:rPr>
+                <w:rtl w:val="0"/>
+              </w:rPr>
+            </w:pPr>
+            <w:r>
+              <w:rPr>
+                <w:rFonts w:ascii="Calibri" w:cs="Arial Unicode MS" w:hAnsi="Calibri" w:eastAsia="Arial Unicode MS"/>
+                <w:b w:val="0"/>
+                <w:bCs w:val="0"/>
+                <w:i w:val="0"/>
+                <w:iCs w:val="0"/>
+                <w:caps w:val="0"/>
+                <w:smallCaps w:val="0"/>
+                <w:strike w:val="0"/>
+                <w:dstrike w:val="0"/>
+                <w:outline w:val="0"/>
+                <w:color w:val="000000"/>
+                <w:spacing w:val="0"/>
+                <w:kern w:val="0"/>
+                <w:position w:val="0"/>
+                <w:sz w:val="36"/>
+                <w:szCs w:val="36"/>
+                <w:u w:val="none"/>
+                <w:shd w:val="nil" w:color="auto" w:fill="auto"/>
+                <w:vertAlign w:val="baseline"/>
+                <w:rtl w:val="0"/>
+                <w14:textOutline w14:w="12700" w14:cap="flat">
+                  <w14:noFill/>
+                  <w14:miter w14:lim="400000"/>
+                </w14:textOutline>
+                <w14:textFill>
+                  <w14:solidFill>
+                    <w14:srgbClr w14:val="000000"/>
+                  </w14:solidFill>
+                </w14:textFill>
+              </w:rPr>
+              <w:t>Start date</w:t>
+            </w:r>
+          </w:p>
+        </w:tc>
+        <w:tc>
+          <w:tcPr>
+            <w:tcW w:type="dxa" w:w="4670"/>
+            <w:tcBorders>
+              <w:top w:val="single" w:color="ffffff" w:sz="8" w:space="0" w:shadow="0" w:frame="0"/>
+              <w:left w:val="single" w:color="ffffff" w:sz="8" w:space="0" w:shadow="0" w:frame="0"/>
+              <w:bottom w:val="single" w:color="ffffff" w:sz="8" w:space="0" w:shadow="0" w:frame="0"/>
+              <w:right w:val="single" w:color="ffffff" w:sz="8" w:space="0" w:shadow="0" w:frame="0"/>
+            </w:tcBorders>
+            <w:shd w:val="clear" w:color="auto" w:fill="e7eaf4"/>
+            <w:tcMar>
+              <w:top w:type="dxa" w:w="0"/>
+              <w:left w:type="dxa" w:w="0"/>
+              <w:bottom w:type="dxa" w:w="0"/>
+              <w:right w:type="dxa" w:w="0"/>
+            </w:tcMar>
+            <w:vAlign w:val="top"/>
+          </w:tcPr>
+          <w:p/>
+        </w:tc>
+      </w:tr>
+      <w:tr>
+        <w:tblPrEx>
+          <w:shd w:val="clear" w:color="auto" w:fill="cdd4e9"/>
+        </w:tblPrEx>
+        <w:trPr>
+          <w:trHeight w:val="436" w:hRule="atLeast"/>
+        </w:trPr>
+        <w:tc>
+          <w:tcPr>
+            <w:tcW w:type="dxa" w:w="4670"/>
+            <w:tcBorders>
+              <w:top w:val="single" w:color="ffffff" w:sz="8" w:space="0" w:shadow="0" w:frame="0"/>
+              <w:left w:val="single" w:color="ffffff" w:sz="8" w:space="0" w:shadow="0" w:frame="0"/>
+              <w:bottom w:val="single" w:color="ffffff" w:sz="8" w:space="0" w:shadow="0" w:frame="0"/>
+              <w:right w:val="single" w:color="ffffff" w:sz="8" w:space="0" w:shadow="0" w:frame="0"/>
+            </w:tcBorders>
+            <w:shd w:val="clear" w:color="auto" w:fill="cdd4e9"/>
+            <w:tcMar>
+              <w:top w:type="dxa" w:w="0"/>
+              <w:left w:type="dxa" w:w="0"/>
+              <w:bottom w:type="dxa" w:w="0"/>
+              <w:right w:type="dxa" w:w="0"/>
+            </w:tcMar>
+            <w:vAlign w:val="top"/>
+          </w:tcPr>
+          <w:p>
+            <w:pPr>
+              <w:keepNext w:val="0"/>
+              <w:keepLines w:val="0"/>
+              <w:pageBreakBefore w:val="0"/>
+              <w:widowControl w:val="1"/>
+              <w:shd w:val="clear" w:color="auto" w:fill="auto"/>
+              <w:suppressAutoHyphens w:val="1"/>
+              <w:bidi w:val="0"/>
+              <w:spacing w:before="0" w:after="0" w:line="240" w:lineRule="auto"/>
+              <w:ind w:left="0" w:right="0" w:firstLine="0"/>
+              <w:jc w:val="left"/>
+              <w:outlineLvl w:val="0"/>
+              <w:rPr>
+                <w:rtl w:val="0"/>
+              </w:rPr>
+            </w:pPr>
+            <w:r>
+              <w:rPr>
+                <w:rFonts w:ascii="Calibri" w:cs="Arial Unicode MS" w:hAnsi="Calibri" w:eastAsia="Arial Unicode MS"/>
+                <w:b w:val="0"/>
+                <w:bCs w:val="0"/>
+                <w:i w:val="0"/>
+                <w:iCs w:val="0"/>
+                <w:caps w:val="0"/>
+                <w:smallCaps w:val="0"/>
+                <w:strike w:val="0"/>
+                <w:dstrike w:val="0"/>
+                <w:outline w:val="0"/>
+                <w:color w:val="000000"/>
+                <w:spacing w:val="0"/>
+                <w:kern w:val="0"/>
+                <w:position w:val="0"/>
+                <w:sz w:val="36"/>
+                <w:szCs w:val="36"/>
+                <w:u w:val="none"/>
+                <w:shd w:val="nil" w:color="auto" w:fill="auto"/>
+                <w:vertAlign w:val="baseline"/>
+                <w:rtl w:val="0"/>
+                <w14:textOutline w14:w="12700" w14:cap="flat">
+                  <w14:noFill/>
+                  <w14:miter w14:lim="400000"/>
+                </w14:textOutline>
+                <w14:textFill>
+                  <w14:solidFill>
+                    <w14:srgbClr w14:val="000000"/>
+                  </w14:solidFill>
+                </w14:textFill>
+              </w:rPr>
+              <w:t>Completion date</w:t>
+            </w:r>
+          </w:p>
+        </w:tc>
+        <w:tc>
+          <w:tcPr>
+            <w:tcW w:type="dxa" w:w="4670"/>
+            <w:tcBorders>
+              <w:top w:val="single" w:color="ffffff" w:sz="8" w:space="0" w:shadow="0" w:frame="0"/>
+              <w:left w:val="single" w:color="ffffff" w:sz="8" w:space="0" w:shadow="0" w:frame="0"/>
+              <w:bottom w:val="single" w:color="ffffff" w:sz="8" w:space="0" w:shadow="0" w:frame="0"/>
+              <w:right w:val="single" w:color="ffffff" w:sz="8" w:space="0" w:shadow="0" w:frame="0"/>
+            </w:tcBorders>
+            <w:shd w:val="clear" w:color="auto" w:fill="cdd4e9"/>
+            <w:tcMar>
+              <w:top w:type="dxa" w:w="0"/>
+              <w:left w:type="dxa" w:w="0"/>
+              <w:bottom w:type="dxa" w:w="0"/>
+              <w:right w:type="dxa" w:w="0"/>
+            </w:tcMar>
+            <w:vAlign w:val="top"/>
+          </w:tcPr>
+          <w:p/>
+        </w:tc>
+      </w:tr>
+      <w:tr>
+        <w:tblPrEx>
+          <w:shd w:val="clear" w:color="auto" w:fill="cdd4e9"/>
+        </w:tblPrEx>
+        <w:trPr>
+          <w:trHeight w:val="436" w:hRule="atLeast"/>
+        </w:trPr>
+        <w:tc>
+          <w:tcPr>
+            <w:tcW w:type="dxa" w:w="4670"/>
+            <w:tcBorders>
+              <w:top w:val="single" w:color="ffffff" w:sz="8" w:space="0" w:shadow="0" w:frame="0"/>
+              <w:left w:val="single" w:color="ffffff" w:sz="8" w:space="0" w:shadow="0" w:frame="0"/>
+              <w:bottom w:val="single" w:color="ffffff" w:sz="8" w:space="0" w:shadow="0" w:frame="0"/>
+              <w:right w:val="single" w:color="ffffff" w:sz="8" w:space="0" w:shadow="0" w:frame="0"/>
+            </w:tcBorders>
+            <w:shd w:val="clear" w:color="auto" w:fill="e7eaf4"/>
+            <w:tcMar>
+              <w:top w:type="dxa" w:w="0"/>
+              <w:left w:type="dxa" w:w="0"/>
+              <w:bottom w:type="dxa" w:w="0"/>
+              <w:right w:type="dxa" w:w="0"/>
+            </w:tcMar>
+            <w:vAlign w:val="top"/>
+          </w:tcPr>
+          <w:p>
+            <w:pPr>
+              <w:keepNext w:val="0"/>
+              <w:keepLines w:val="0"/>
+              <w:pageBreakBefore w:val="0"/>
+              <w:widowControl w:val="1"/>
+              <w:shd w:val="clear" w:color="auto" w:fill="auto"/>
+              <w:suppressAutoHyphens w:val="1"/>
+              <w:bidi w:val="0"/>
+              <w:spacing w:before="0" w:after="0" w:line="240" w:lineRule="auto"/>
+              <w:ind w:left="0" w:right="0" w:firstLine="0"/>
+              <w:jc w:val="left"/>
+              <w:outlineLvl w:val="0"/>
+              <w:rPr>
+                <w:rtl w:val="0"/>
+              </w:rPr>
+            </w:pPr>
+            <w:r>
+              <w:rPr>
+                <w:rFonts w:ascii="Calibri" w:cs="Arial Unicode MS" w:hAnsi="Calibri" w:eastAsia="Arial Unicode MS"/>
+                <w:b w:val="0"/>
+                <w:bCs w:val="0"/>
+                <w:i w:val="0"/>
+                <w:iCs w:val="0"/>
+                <w:caps w:val="0"/>
+                <w:smallCaps w:val="0"/>
+                <w:strike w:val="0"/>
+                <w:dstrike w:val="0"/>
+                <w:outline w:val="0"/>
+                <w:color w:val="000000"/>
+                <w:spacing w:val="0"/>
+                <w:kern w:val="0"/>
+                <w:position w:val="0"/>
+                <w:sz w:val="36"/>
+                <w:szCs w:val="36"/>
+                <w:u w:val="none"/>
+                <w:shd w:val="nil" w:color="auto" w:fill="auto"/>
+                <w:vertAlign w:val="baseline"/>
+                <w:rtl w:val="0"/>
+                <w14:textOutline w14:w="12700" w14:cap="flat">
+                  <w14:noFill/>
+                  <w14:miter w14:lim="400000"/>
+                </w14:textOutline>
+                <w14:textFill>
+                  <w14:solidFill>
+                    <w14:srgbClr w14:val="000000"/>
+                  </w14:solidFill>
+                </w14:textFill>
+              </w:rPr>
+              <w:t>Person assigned to the task</w:t>
+            </w:r>
+          </w:p>
+        </w:tc>
+        <w:tc>
+          <w:tcPr>
+            <w:tcW w:type="dxa" w:w="4670"/>
+            <w:tcBorders>
+              <w:top w:val="single" w:color="ffffff" w:sz="8" w:space="0" w:shadow="0" w:frame="0"/>
+              <w:left w:val="single" w:color="ffffff" w:sz="8" w:space="0" w:shadow="0" w:frame="0"/>
+              <w:bottom w:val="single" w:color="ffffff" w:sz="8" w:space="0" w:shadow="0" w:frame="0"/>
+              <w:right w:val="single" w:color="ffffff" w:sz="8" w:space="0" w:shadow="0" w:frame="0"/>
+            </w:tcBorders>
+            <w:shd w:val="clear" w:color="auto" w:fill="e7eaf4"/>
+            <w:tcMar>
+              <w:top w:type="dxa" w:w="0"/>
+              <w:left w:type="dxa" w:w="0"/>
+              <w:bottom w:type="dxa" w:w="0"/>
+              <w:right w:type="dxa" w:w="0"/>
+            </w:tcMar>
+            <w:vAlign w:val="top"/>
+          </w:tcPr>
+          <w:p/>
+        </w:tc>
+      </w:tr>
+      <w:tr>
+        <w:tblPrEx>
+          <w:shd w:val="clear" w:color="auto" w:fill="cdd4e9"/>
+        </w:tblPrEx>
+        <w:trPr>
+          <w:trHeight w:val="436" w:hRule="atLeast"/>
+        </w:trPr>
+        <w:tc>
+          <w:tcPr>
+            <w:tcW w:type="dxa" w:w="4670"/>
+            <w:tcBorders>
+              <w:top w:val="single" w:color="ffffff" w:sz="8" w:space="0" w:shadow="0" w:frame="0"/>
+              <w:left w:val="single" w:color="ffffff" w:sz="8" w:space="0" w:shadow="0" w:frame="0"/>
+              <w:bottom w:val="single" w:color="ffffff" w:sz="8" w:space="0" w:shadow="0" w:frame="0"/>
+              <w:right w:val="single" w:color="ffffff" w:sz="8" w:space="0" w:shadow="0" w:frame="0"/>
+            </w:tcBorders>
+            <w:shd w:val="clear" w:color="auto" w:fill="cdd4e9"/>
+            <w:tcMar>
+              <w:top w:type="dxa" w:w="0"/>
+              <w:left w:type="dxa" w:w="0"/>
+              <w:bottom w:type="dxa" w:w="0"/>
+              <w:right w:type="dxa" w:w="0"/>
+            </w:tcMar>
+            <w:vAlign w:val="top"/>
+          </w:tcPr>
+          <w:p>
+            <w:pPr>
+              <w:keepNext w:val="0"/>
+              <w:keepLines w:val="0"/>
+              <w:pageBreakBefore w:val="0"/>
+              <w:widowControl w:val="1"/>
+              <w:shd w:val="clear" w:color="auto" w:fill="auto"/>
+              <w:suppressAutoHyphens w:val="1"/>
+              <w:bidi w:val="0"/>
+              <w:spacing w:before="0" w:after="0" w:line="240" w:lineRule="auto"/>
+              <w:ind w:left="0" w:right="0" w:firstLine="0"/>
+              <w:jc w:val="left"/>
+              <w:outlineLvl w:val="0"/>
+              <w:rPr>
+                <w:rtl w:val="0"/>
+              </w:rPr>
+            </w:pPr>
+            <w:r>
+              <w:rPr>
+                <w:rFonts w:ascii="Calibri" w:cs="Arial Unicode MS" w:hAnsi="Calibri" w:eastAsia="Arial Unicode MS"/>
+                <w:b w:val="0"/>
+                <w:bCs w:val="0"/>
+                <w:i w:val="0"/>
+                <w:iCs w:val="0"/>
+                <w:caps w:val="0"/>
+                <w:smallCaps w:val="0"/>
+                <w:strike w:val="0"/>
+                <w:dstrike w:val="0"/>
+                <w:outline w:val="0"/>
+                <w:color w:val="000000"/>
+                <w:spacing w:val="0"/>
+                <w:kern w:val="0"/>
+                <w:position w:val="0"/>
+                <w:sz w:val="36"/>
+                <w:szCs w:val="36"/>
+                <w:u w:val="none"/>
+                <w:shd w:val="nil" w:color="auto" w:fill="auto"/>
+                <w:vertAlign w:val="baseline"/>
+                <w:rtl w:val="0"/>
+                <w14:textOutline w14:w="12700" w14:cap="flat">
+                  <w14:noFill/>
+                  <w14:miter w14:lim="400000"/>
+                </w14:textOutline>
+                <w14:textFill>
+                  <w14:solidFill>
+                    <w14:srgbClr w14:val="000000"/>
+                  </w14:solidFill>
+                </w14:textFill>
+              </w:rPr>
+              <w:t>Deliverable(s)</w:t>
+            </w:r>
+          </w:p>
+        </w:tc>
+        <w:tc>
+          <w:tcPr>
+            <w:tcW w:type="dxa" w:w="4670"/>
+            <w:tcBorders>
+              <w:top w:val="single" w:color="ffffff" w:sz="8" w:space="0" w:shadow="0" w:frame="0"/>
+              <w:left w:val="single" w:color="ffffff" w:sz="8" w:space="0" w:shadow="0" w:frame="0"/>
+              <w:bottom w:val="single" w:color="ffffff" w:sz="8" w:space="0" w:shadow="0" w:frame="0"/>
+              <w:right w:val="single" w:color="ffffff" w:sz="8" w:space="0" w:shadow="0" w:frame="0"/>
+            </w:tcBorders>
+            <w:shd w:val="clear" w:color="auto" w:fill="cdd4e9"/>
+            <w:tcMar>
+              <w:top w:type="dxa" w:w="0"/>
+              <w:left w:type="dxa" w:w="0"/>
+              <w:bottom w:type="dxa" w:w="0"/>
+              <w:right w:type="dxa" w:w="0"/>
+            </w:tcMar>
+            <w:vAlign w:val="top"/>
+          </w:tcPr>
+          <w:p/>
+        </w:tc>
+      </w:tr>
+      <w:tr>
+        <w:tblPrEx>
+          <w:shd w:val="clear" w:color="auto" w:fill="cdd4e9"/>
+        </w:tblPrEx>
+        <w:trPr>
+          <w:trHeight w:val="436" w:hRule="atLeast"/>
+        </w:trPr>
+        <w:tc>
+          <w:tcPr>
+            <w:tcW w:type="dxa" w:w="4670"/>
+            <w:tcBorders>
+              <w:top w:val="single" w:color="ffffff" w:sz="8" w:space="0" w:shadow="0" w:frame="0"/>
+              <w:left w:val="single" w:color="ffffff" w:sz="8" w:space="0" w:shadow="0" w:frame="0"/>
+              <w:bottom w:val="single" w:color="ffffff" w:sz="8" w:space="0" w:shadow="0" w:frame="0"/>
+              <w:right w:val="single" w:color="ffffff" w:sz="8" w:space="0" w:shadow="0" w:frame="0"/>
+            </w:tcBorders>
+            <w:shd w:val="clear" w:color="auto" w:fill="e7eaf4"/>
+            <w:tcMar>
+              <w:top w:type="dxa" w:w="0"/>
+              <w:left w:type="dxa" w:w="0"/>
+              <w:bottom w:type="dxa" w:w="0"/>
+              <w:right w:type="dxa" w:w="0"/>
+            </w:tcMar>
+            <w:vAlign w:val="top"/>
+          </w:tcPr>
+          <w:p>
+            <w:pPr>
+              <w:keepNext w:val="0"/>
+              <w:keepLines w:val="0"/>
+              <w:pageBreakBefore w:val="0"/>
+              <w:widowControl w:val="1"/>
+              <w:shd w:val="clear" w:color="auto" w:fill="auto"/>
+              <w:suppressAutoHyphens w:val="1"/>
+              <w:bidi w:val="0"/>
+              <w:spacing w:before="0" w:after="0" w:line="240" w:lineRule="auto"/>
+              <w:ind w:left="0" w:right="0" w:firstLine="0"/>
+              <w:jc w:val="left"/>
+              <w:outlineLvl w:val="0"/>
+              <w:rPr>
+                <w:rtl w:val="0"/>
+              </w:rPr>
+            </w:pPr>
+            <w:r>
+              <w:rPr>
+                <w:rFonts w:ascii="Calibri" w:cs="Arial Unicode MS" w:hAnsi="Calibri" w:eastAsia="Arial Unicode MS"/>
+                <w:b w:val="0"/>
+                <w:bCs w:val="0"/>
+                <w:i w:val="0"/>
+                <w:iCs w:val="0"/>
+                <w:caps w:val="0"/>
+                <w:smallCaps w:val="0"/>
+                <w:strike w:val="0"/>
+                <w:dstrike w:val="0"/>
+                <w:outline w:val="0"/>
+                <w:color w:val="000000"/>
+                <w:spacing w:val="0"/>
+                <w:kern w:val="0"/>
+                <w:position w:val="0"/>
+                <w:sz w:val="36"/>
+                <w:szCs w:val="36"/>
+                <w:u w:val="none"/>
+                <w:shd w:val="nil" w:color="auto" w:fill="auto"/>
+                <w:vertAlign w:val="baseline"/>
+                <w:rtl w:val="0"/>
+                <w14:textOutline w14:w="12700" w14:cap="flat">
+                  <w14:noFill/>
+                  <w14:miter w14:lim="400000"/>
+                </w14:textOutline>
+                <w14:textFill>
+                  <w14:solidFill>
+                    <w14:srgbClr w14:val="000000"/>
+                  </w14:solidFill>
+                </w14:textFill>
+              </w:rPr>
+              <w:t>Completion status</w:t>
+            </w:r>
+          </w:p>
+        </w:tc>
+        <w:tc>
+          <w:tcPr>
+            <w:tcW w:type="dxa" w:w="4670"/>
+            <w:tcBorders>
+              <w:top w:val="single" w:color="ffffff" w:sz="8" w:space="0" w:shadow="0" w:frame="0"/>
+              <w:left w:val="single" w:color="ffffff" w:sz="8" w:space="0" w:shadow="0" w:frame="0"/>
+              <w:bottom w:val="single" w:color="ffffff" w:sz="8" w:space="0" w:shadow="0" w:frame="0"/>
+              <w:right w:val="single" w:color="ffffff" w:sz="8" w:space="0" w:shadow="0" w:frame="0"/>
+            </w:tcBorders>
+            <w:shd w:val="clear" w:color="auto" w:fill="e7eaf4"/>
+            <w:tcMar>
+              <w:top w:type="dxa" w:w="0"/>
+              <w:left w:type="dxa" w:w="0"/>
+              <w:bottom w:type="dxa" w:w="0"/>
+              <w:right w:type="dxa" w:w="0"/>
+            </w:tcMar>
+            <w:vAlign w:val="top"/>
+          </w:tcPr>
+          <w:p/>
+        </w:tc>
+      </w:tr>
+      <w:tr>
+        <w:tblPrEx>
+          <w:shd w:val="clear" w:color="auto" w:fill="cdd4e9"/>
+        </w:tblPrEx>
+        <w:trPr>
+          <w:trHeight w:val="436" w:hRule="atLeast"/>
+        </w:trPr>
+        <w:tc>
+          <w:tcPr>
+            <w:tcW w:type="dxa" w:w="4670"/>
+            <w:tcBorders>
+              <w:top w:val="single" w:color="ffffff" w:sz="8" w:space="0" w:shadow="0" w:frame="0"/>
+              <w:left w:val="single" w:color="ffffff" w:sz="8" w:space="0" w:shadow="0" w:frame="0"/>
+              <w:bottom w:val="single" w:color="ffffff" w:sz="8" w:space="0" w:shadow="0" w:frame="0"/>
+              <w:right w:val="single" w:color="ffffff" w:sz="8" w:space="0" w:shadow="0" w:frame="0"/>
+            </w:tcBorders>
+            <w:shd w:val="clear" w:color="auto" w:fill="cdd4e9"/>
+            <w:tcMar>
+              <w:top w:type="dxa" w:w="0"/>
+              <w:left w:type="dxa" w:w="0"/>
+              <w:bottom w:type="dxa" w:w="0"/>
+              <w:right w:type="dxa" w:w="0"/>
+            </w:tcMar>
+            <w:vAlign w:val="top"/>
+          </w:tcPr>
+          <w:p>
+            <w:pPr>
+              <w:keepNext w:val="0"/>
+              <w:keepLines w:val="0"/>
+              <w:pageBreakBefore w:val="0"/>
+              <w:widowControl w:val="1"/>
+              <w:shd w:val="clear" w:color="auto" w:fill="auto"/>
+              <w:suppressAutoHyphens w:val="1"/>
+              <w:bidi w:val="0"/>
+              <w:spacing w:before="0" w:after="0" w:line="240" w:lineRule="auto"/>
+              <w:ind w:left="0" w:right="0" w:firstLine="0"/>
+              <w:jc w:val="left"/>
+              <w:outlineLvl w:val="0"/>
+              <w:rPr>
+                <w:rtl w:val="0"/>
+              </w:rPr>
+            </w:pPr>
+            <w:r>
+              <w:rPr>
+                <w:rFonts w:ascii="Calibri" w:cs="Arial Unicode MS" w:hAnsi="Calibri" w:eastAsia="Arial Unicode MS"/>
+                <w:b w:val="0"/>
+                <w:bCs w:val="0"/>
+                <w:i w:val="0"/>
+                <w:iCs w:val="0"/>
+                <w:caps w:val="0"/>
+                <w:smallCaps w:val="0"/>
+                <w:strike w:val="0"/>
+                <w:dstrike w:val="0"/>
+                <w:outline w:val="0"/>
+                <w:color w:val="000000"/>
+                <w:spacing w:val="0"/>
+                <w:kern w:val="0"/>
+                <w:position w:val="0"/>
+                <w:sz w:val="36"/>
+                <w:szCs w:val="36"/>
+                <w:u w:val="none"/>
+                <w:shd w:val="nil" w:color="auto" w:fill="auto"/>
+                <w:vertAlign w:val="baseline"/>
+                <w:rtl w:val="0"/>
+                <w14:textOutline w14:w="12700" w14:cap="flat">
+                  <w14:noFill/>
+                  <w14:miter w14:lim="400000"/>
+                </w14:textOutline>
+                <w14:textFill>
+                  <w14:solidFill>
+                    <w14:srgbClr w14:val="000000"/>
+                  </w14:solidFill>
+                </w14:textFill>
+              </w:rPr>
+              <w:t>Priority*</w:t>
+            </w:r>
+          </w:p>
+        </w:tc>
+        <w:tc>
+          <w:tcPr>
+            <w:tcW w:type="dxa" w:w="4670"/>
+            <w:tcBorders>
+              <w:top w:val="single" w:color="ffffff" w:sz="8" w:space="0" w:shadow="0" w:frame="0"/>
+              <w:left w:val="single" w:color="ffffff" w:sz="8" w:space="0" w:shadow="0" w:frame="0"/>
+              <w:bottom w:val="single" w:color="ffffff" w:sz="8" w:space="0" w:shadow="0" w:frame="0"/>
+              <w:right w:val="single" w:color="ffffff" w:sz="8" w:space="0" w:shadow="0" w:frame="0"/>
+            </w:tcBorders>
+            <w:shd w:val="clear" w:color="auto" w:fill="cdd4e9"/>
+            <w:tcMar>
+              <w:top w:type="dxa" w:w="0"/>
+              <w:left w:type="dxa" w:w="0"/>
+              <w:bottom w:type="dxa" w:w="0"/>
+              <w:right w:type="dxa" w:w="0"/>
+            </w:tcMar>
+            <w:vAlign w:val="top"/>
+          </w:tcPr>
+          <w:p/>
+        </w:tc>
+      </w:tr>
+      <w:tr>
+        <w:tblPrEx>
+          <w:shd w:val="clear" w:color="auto" w:fill="cdd4e9"/>
+        </w:tblPrEx>
+        <w:trPr>
+          <w:trHeight w:val="436" w:hRule="atLeast"/>
+        </w:trPr>
+        <w:tc>
+          <w:tcPr>
+            <w:tcW w:type="dxa" w:w="4670"/>
+            <w:tcBorders>
+              <w:top w:val="single" w:color="ffffff" w:sz="8" w:space="0" w:shadow="0" w:frame="0"/>
+              <w:left w:val="single" w:color="ffffff" w:sz="8" w:space="0" w:shadow="0" w:frame="0"/>
+              <w:bottom w:val="single" w:color="ffffff" w:sz="8" w:space="0" w:shadow="0" w:frame="0"/>
+              <w:right w:val="single" w:color="ffffff" w:sz="8" w:space="0" w:shadow="0" w:frame="0"/>
+            </w:tcBorders>
+            <w:shd w:val="clear" w:color="auto" w:fill="e7eaf4"/>
+            <w:tcMar>
+              <w:top w:type="dxa" w:w="0"/>
+              <w:left w:type="dxa" w:w="0"/>
+              <w:bottom w:type="dxa" w:w="0"/>
+              <w:right w:type="dxa" w:w="0"/>
+            </w:tcMar>
+            <w:vAlign w:val="top"/>
+          </w:tcPr>
+          <w:p>
+            <w:pPr>
+              <w:keepNext w:val="0"/>
+              <w:keepLines w:val="0"/>
+              <w:pageBreakBefore w:val="0"/>
+              <w:widowControl w:val="1"/>
+              <w:shd w:val="clear" w:color="auto" w:fill="auto"/>
+              <w:suppressAutoHyphens w:val="1"/>
+              <w:bidi w:val="0"/>
+              <w:spacing w:before="0" w:after="0" w:line="240" w:lineRule="auto"/>
+              <w:ind w:left="0" w:right="0" w:firstLine="0"/>
+              <w:jc w:val="left"/>
+              <w:outlineLvl w:val="0"/>
+              <w:rPr>
+                <w:rtl w:val="0"/>
+              </w:rPr>
+            </w:pPr>
+            <w:r>
+              <w:rPr>
+                <w:rFonts w:ascii="Calibri" w:cs="Arial Unicode MS" w:hAnsi="Calibri" w:eastAsia="Arial Unicode MS"/>
+                <w:b w:val="0"/>
+                <w:bCs w:val="0"/>
+                <w:i w:val="0"/>
+                <w:iCs w:val="0"/>
+                <w:caps w:val="0"/>
+                <w:smallCaps w:val="0"/>
+                <w:strike w:val="0"/>
+                <w:dstrike w:val="0"/>
+                <w:outline w:val="0"/>
+                <w:color w:val="000000"/>
+                <w:spacing w:val="0"/>
+                <w:kern w:val="0"/>
+                <w:position w:val="0"/>
+                <w:sz w:val="36"/>
+                <w:szCs w:val="36"/>
+                <w:u w:val="none"/>
+                <w:shd w:val="nil" w:color="auto" w:fill="auto"/>
+                <w:vertAlign w:val="baseline"/>
+                <w:rtl w:val="0"/>
+                <w14:textOutline w14:w="12700" w14:cap="flat">
+                  <w14:noFill/>
+                  <w14:miter w14:lim="400000"/>
+                </w14:textOutline>
+                <w14:textFill>
+                  <w14:solidFill>
+                    <w14:srgbClr w14:val="000000"/>
+                  </w14:solidFill>
+                </w14:textFill>
+              </w:rPr>
+              <w:t>Resources that are needed</w:t>
+            </w:r>
+          </w:p>
+        </w:tc>
+        <w:tc>
+          <w:tcPr>
+            <w:tcW w:type="dxa" w:w="4670"/>
+            <w:tcBorders>
+              <w:top w:val="single" w:color="ffffff" w:sz="8" w:space="0" w:shadow="0" w:frame="0"/>
+              <w:left w:val="single" w:color="ffffff" w:sz="8" w:space="0" w:shadow="0" w:frame="0"/>
+              <w:bottom w:val="single" w:color="ffffff" w:sz="8" w:space="0" w:shadow="0" w:frame="0"/>
+              <w:right w:val="single" w:color="ffffff" w:sz="8" w:space="0" w:shadow="0" w:frame="0"/>
+            </w:tcBorders>
+            <w:shd w:val="clear" w:color="auto" w:fill="e7eaf4"/>
+            <w:tcMar>
+              <w:top w:type="dxa" w:w="0"/>
+              <w:left w:type="dxa" w:w="0"/>
+              <w:bottom w:type="dxa" w:w="0"/>
+              <w:right w:type="dxa" w:w="0"/>
+            </w:tcMar>
+            <w:vAlign w:val="top"/>
+          </w:tcPr>
+          <w:p/>
+        </w:tc>
+      </w:tr>
+      <w:tr>
+        <w:tblPrEx>
+          <w:shd w:val="clear" w:color="auto" w:fill="cdd4e9"/>
+        </w:tblPrEx>
+        <w:trPr>
+          <w:trHeight w:val="436" w:hRule="atLeast"/>
+        </w:trPr>
+        <w:tc>
+          <w:tcPr>
+            <w:tcW w:type="dxa" w:w="4670"/>
+            <w:tcBorders>
+              <w:top w:val="single" w:color="ffffff" w:sz="8" w:space="0" w:shadow="0" w:frame="0"/>
+              <w:left w:val="single" w:color="ffffff" w:sz="8" w:space="0" w:shadow="0" w:frame="0"/>
+              <w:bottom w:val="single" w:color="ffffff" w:sz="8" w:space="0" w:shadow="0" w:frame="0"/>
+              <w:right w:val="single" w:color="ffffff" w:sz="8" w:space="0" w:shadow="0" w:frame="0"/>
+            </w:tcBorders>
+            <w:shd w:val="clear" w:color="auto" w:fill="cdd4e9"/>
+            <w:tcMar>
+              <w:top w:type="dxa" w:w="0"/>
+              <w:left w:type="dxa" w:w="0"/>
+              <w:bottom w:type="dxa" w:w="0"/>
+              <w:right w:type="dxa" w:w="0"/>
+            </w:tcMar>
+            <w:vAlign w:val="top"/>
+          </w:tcPr>
+          <w:p>
+            <w:pPr>
+              <w:keepNext w:val="0"/>
+              <w:keepLines w:val="0"/>
+              <w:pageBreakBefore w:val="0"/>
+              <w:widowControl w:val="1"/>
+              <w:shd w:val="clear" w:color="auto" w:fill="auto"/>
+              <w:suppressAutoHyphens w:val="1"/>
+              <w:bidi w:val="0"/>
+              <w:spacing w:before="0" w:after="0" w:line="240" w:lineRule="auto"/>
+              <w:ind w:left="0" w:right="0" w:firstLine="0"/>
+              <w:jc w:val="left"/>
+              <w:outlineLvl w:val="0"/>
+              <w:rPr>
+                <w:rtl w:val="0"/>
+              </w:rPr>
+            </w:pPr>
+            <w:r>
+              <w:rPr>
+                <w:rFonts w:ascii="Calibri" w:cs="Arial Unicode MS" w:hAnsi="Calibri" w:eastAsia="Arial Unicode MS"/>
+                <w:b w:val="0"/>
+                <w:bCs w:val="0"/>
+                <w:i w:val="0"/>
+                <w:iCs w:val="0"/>
+                <w:caps w:val="0"/>
+                <w:smallCaps w:val="0"/>
+                <w:strike w:val="0"/>
+                <w:dstrike w:val="0"/>
+                <w:outline w:val="0"/>
+                <w:color w:val="000000"/>
+                <w:spacing w:val="0"/>
+                <w:kern w:val="0"/>
+                <w:position w:val="0"/>
+                <w:sz w:val="36"/>
+                <w:szCs w:val="36"/>
+                <w:u w:val="none"/>
+                <w:shd w:val="nil" w:color="auto" w:fill="auto"/>
+                <w:vertAlign w:val="baseline"/>
+                <w:rtl w:val="0"/>
+                <w14:textOutline w14:w="12700" w14:cap="flat">
+                  <w14:noFill/>
+                  <w14:miter w14:lim="400000"/>
+                </w14:textOutline>
+                <w14:textFill>
+                  <w14:solidFill>
+                    <w14:srgbClr w14:val="000000"/>
+                  </w14:solidFill>
+                </w14:textFill>
+              </w:rPr>
+              <w:t>Estimated time</w:t>
+            </w:r>
+          </w:p>
+        </w:tc>
+        <w:tc>
+          <w:tcPr>
+            <w:tcW w:type="dxa" w:w="4670"/>
+            <w:tcBorders>
+              <w:top w:val="single" w:color="ffffff" w:sz="8" w:space="0" w:shadow="0" w:frame="0"/>
+              <w:left w:val="single" w:color="ffffff" w:sz="8" w:space="0" w:shadow="0" w:frame="0"/>
+              <w:bottom w:val="single" w:color="ffffff" w:sz="8" w:space="0" w:shadow="0" w:frame="0"/>
+              <w:right w:val="single" w:color="ffffff" w:sz="8" w:space="0" w:shadow="0" w:frame="0"/>
+            </w:tcBorders>
+            <w:shd w:val="clear" w:color="auto" w:fill="cdd4e9"/>
+            <w:tcMar>
+              <w:top w:type="dxa" w:w="0"/>
+              <w:left w:type="dxa" w:w="0"/>
+              <w:bottom w:type="dxa" w:w="0"/>
+              <w:right w:type="dxa" w:w="0"/>
+            </w:tcMar>
+            <w:vAlign w:val="top"/>
+          </w:tcPr>
+          <w:p/>
+        </w:tc>
+      </w:tr>
+      <w:tr>
+        <w:tblPrEx>
+          <w:shd w:val="clear" w:color="auto" w:fill="cdd4e9"/>
+        </w:tblPrEx>
+        <w:trPr>
+          <w:trHeight w:val="436" w:hRule="atLeast"/>
+        </w:trPr>
+        <w:tc>
+          <w:tcPr>
+            <w:tcW w:type="dxa" w:w="4670"/>
+            <w:tcBorders>
+              <w:top w:val="single" w:color="ffffff" w:sz="8" w:space="0" w:shadow="0" w:frame="0"/>
+              <w:left w:val="single" w:color="ffffff" w:sz="8" w:space="0" w:shadow="0" w:frame="0"/>
+              <w:bottom w:val="single" w:color="ffffff" w:sz="8" w:space="0" w:shadow="0" w:frame="0"/>
+              <w:right w:val="single" w:color="ffffff" w:sz="8" w:space="0" w:shadow="0" w:frame="0"/>
+            </w:tcBorders>
+            <w:shd w:val="clear" w:color="auto" w:fill="e7eaf4"/>
+            <w:tcMar>
+              <w:top w:type="dxa" w:w="0"/>
+              <w:left w:type="dxa" w:w="0"/>
+              <w:bottom w:type="dxa" w:w="0"/>
+              <w:right w:type="dxa" w:w="0"/>
+            </w:tcMar>
+            <w:vAlign w:val="top"/>
+          </w:tcPr>
+          <w:p>
+            <w:pPr>
+              <w:keepNext w:val="0"/>
+              <w:keepLines w:val="0"/>
+              <w:pageBreakBefore w:val="0"/>
+              <w:widowControl w:val="1"/>
+              <w:shd w:val="clear" w:color="auto" w:fill="auto"/>
+              <w:suppressAutoHyphens w:val="1"/>
+              <w:bidi w:val="0"/>
+              <w:spacing w:before="0" w:after="0" w:line="240" w:lineRule="auto"/>
+              <w:ind w:left="0" w:right="0" w:firstLine="0"/>
+              <w:jc w:val="left"/>
+              <w:outlineLvl w:val="0"/>
+              <w:rPr>
+                <w:rtl w:val="0"/>
+              </w:rPr>
+            </w:pPr>
+            <w:r>
+              <w:rPr>
+                <w:rFonts w:ascii="Calibri" w:cs="Arial Unicode MS" w:hAnsi="Calibri" w:eastAsia="Arial Unicode MS"/>
+                <w:b w:val="0"/>
+                <w:bCs w:val="0"/>
+                <w:i w:val="0"/>
+                <w:iCs w:val="0"/>
+                <w:caps w:val="0"/>
+                <w:smallCaps w:val="0"/>
+                <w:strike w:val="0"/>
+                <w:dstrike w:val="0"/>
+                <w:outline w:val="0"/>
+                <w:color w:val="000000"/>
+                <w:spacing w:val="0"/>
+                <w:kern w:val="0"/>
+                <w:position w:val="0"/>
+                <w:sz w:val="36"/>
+                <w:szCs w:val="36"/>
+                <w:u w:val="none"/>
+                <w:shd w:val="nil" w:color="auto" w:fill="auto"/>
+                <w:vertAlign w:val="baseline"/>
+                <w:rtl w:val="0"/>
+                <w14:textOutline w14:w="12700" w14:cap="flat">
+                  <w14:noFill/>
+                  <w14:miter w14:lim="400000"/>
+                </w14:textOutline>
+                <w14:textFill>
+                  <w14:solidFill>
+                    <w14:srgbClr w14:val="000000"/>
+                  </w14:solidFill>
+                </w14:textFill>
+              </w:rPr>
+              <w:t>Actual time</w:t>
+            </w:r>
+          </w:p>
+        </w:tc>
+        <w:tc>
+          <w:tcPr>
+            <w:tcW w:type="dxa" w:w="4670"/>
+            <w:tcBorders>
+              <w:top w:val="single" w:color="ffffff" w:sz="8" w:space="0" w:shadow="0" w:frame="0"/>
+              <w:left w:val="single" w:color="ffffff" w:sz="8" w:space="0" w:shadow="0" w:frame="0"/>
+              <w:bottom w:val="single" w:color="ffffff" w:sz="8" w:space="0" w:shadow="0" w:frame="0"/>
+              <w:right w:val="single" w:color="ffffff" w:sz="8" w:space="0" w:shadow="0" w:frame="0"/>
+            </w:tcBorders>
+            <w:shd w:val="clear" w:color="auto" w:fill="e7eaf4"/>
+            <w:tcMar>
+              <w:top w:type="dxa" w:w="0"/>
+              <w:left w:type="dxa" w:w="0"/>
+              <w:bottom w:type="dxa" w:w="0"/>
+              <w:right w:type="dxa" w:w="0"/>
+            </w:tcMar>
+            <w:vAlign w:val="top"/>
+          </w:tcPr>
+          <w:p/>
+        </w:tc>
+      </w:tr>
+      <w:tr>
+        <w:tblPrEx>
+          <w:shd w:val="clear" w:color="auto" w:fill="cdd4e9"/>
+        </w:tblPrEx>
+        <w:trPr>
+          <w:trHeight w:val="436" w:hRule="atLeast"/>
+        </w:trPr>
+        <w:tc>
+          <w:tcPr>
+            <w:tcW w:type="dxa" w:w="4670"/>
+            <w:tcBorders>
+              <w:top w:val="single" w:color="ffffff" w:sz="8" w:space="0" w:shadow="0" w:frame="0"/>
+              <w:left w:val="single" w:color="ffffff" w:sz="8" w:space="0" w:shadow="0" w:frame="0"/>
+              <w:bottom w:val="single" w:color="ffffff" w:sz="8" w:space="0" w:shadow="0" w:frame="0"/>
+              <w:right w:val="single" w:color="ffffff" w:sz="8" w:space="0" w:shadow="0" w:frame="0"/>
+            </w:tcBorders>
+            <w:shd w:val="clear" w:color="auto" w:fill="cdd4e9"/>
+            <w:tcMar>
+              <w:top w:type="dxa" w:w="0"/>
+              <w:left w:type="dxa" w:w="0"/>
+              <w:bottom w:type="dxa" w:w="0"/>
+              <w:right w:type="dxa" w:w="0"/>
+            </w:tcMar>
+            <w:vAlign w:val="top"/>
+          </w:tcPr>
+          <w:p>
+            <w:pPr>
+              <w:keepNext w:val="0"/>
+              <w:keepLines w:val="0"/>
+              <w:pageBreakBefore w:val="0"/>
+              <w:widowControl w:val="1"/>
+              <w:shd w:val="clear" w:color="auto" w:fill="auto"/>
+              <w:suppressAutoHyphens w:val="1"/>
+              <w:bidi w:val="0"/>
+              <w:spacing w:before="0" w:after="0" w:line="240" w:lineRule="auto"/>
+              <w:ind w:left="0" w:right="0" w:firstLine="0"/>
+              <w:jc w:val="left"/>
+              <w:outlineLvl w:val="0"/>
+              <w:rPr>
+                <w:rtl w:val="0"/>
+              </w:rPr>
+            </w:pPr>
+            <w:r>
+              <w:rPr>
+                <w:rFonts w:ascii="Calibri" w:cs="Arial Unicode MS" w:hAnsi="Calibri" w:eastAsia="Arial Unicode MS"/>
+                <w:b w:val="0"/>
+                <w:bCs w:val="0"/>
+                <w:i w:val="0"/>
+                <w:iCs w:val="0"/>
+                <w:caps w:val="0"/>
+                <w:smallCaps w:val="0"/>
+                <w:strike w:val="0"/>
+                <w:dstrike w:val="0"/>
+                <w:outline w:val="0"/>
+                <w:color w:val="000000"/>
+                <w:spacing w:val="0"/>
+                <w:kern w:val="0"/>
+                <w:position w:val="0"/>
+                <w:sz w:val="36"/>
+                <w:szCs w:val="36"/>
+                <w:u w:val="none"/>
+                <w:shd w:val="nil" w:color="auto" w:fill="auto"/>
+                <w:vertAlign w:val="baseline"/>
+                <w:rtl w:val="0"/>
+                <w14:textOutline w14:w="12700" w14:cap="flat">
+                  <w14:noFill/>
+                  <w14:miter w14:lim="400000"/>
                 </w14:textOutline>
                 <w14:textFill>
                   <w14:solidFill>
@@ -900,50 +1198,150 @@
             </w:r>
           </w:p>
         </w:tc>
+        <w:tc>
+          <w:tcPr>
+            <w:tcW w:type="dxa" w:w="4670"/>
+            <w:tcBorders>
+              <w:top w:val="single" w:color="ffffff" w:sz="8" w:space="0" w:shadow="0" w:frame="0"/>
+              <w:left w:val="single" w:color="ffffff" w:sz="8" w:space="0" w:shadow="0" w:frame="0"/>
+              <w:bottom w:val="single" w:color="ffffff" w:sz="8" w:space="0" w:shadow="0" w:frame="0"/>
+              <w:right w:val="single" w:color="ffffff" w:sz="8" w:space="0" w:shadow="0" w:frame="0"/>
+            </w:tcBorders>
+            <w:shd w:val="clear" w:color="auto" w:fill="cdd4e9"/>
+            <w:tcMar>
+              <w:top w:type="dxa" w:w="0"/>
+              <w:left w:type="dxa" w:w="0"/>
+              <w:bottom w:type="dxa" w:w="0"/>
+              <w:right w:type="dxa" w:w="0"/>
+            </w:tcMar>
+            <w:vAlign w:val="top"/>
+          </w:tcPr>
+          <w:p/>
+        </w:tc>
+      </w:tr>
+      <w:tr>
+        <w:tblPrEx>
+          <w:shd w:val="clear" w:color="auto" w:fill="cdd4e9"/>
+        </w:tblPrEx>
+        <w:trPr>
+          <w:trHeight w:val="436" w:hRule="atLeast"/>
+        </w:trPr>
+        <w:tc>
+          <w:tcPr>
+            <w:tcW w:type="dxa" w:w="4670"/>
+            <w:tcBorders>
+              <w:top w:val="single" w:color="ffffff" w:sz="8" w:space="0" w:shadow="0" w:frame="0"/>
+              <w:left w:val="single" w:color="ffffff" w:sz="8" w:space="0" w:shadow="0" w:frame="0"/>
+              <w:bottom w:val="single" w:color="ffffff" w:sz="8" w:space="0" w:shadow="0" w:frame="0"/>
+              <w:right w:val="single" w:color="ffffff" w:sz="8" w:space="0" w:shadow="0" w:frame="0"/>
+            </w:tcBorders>
+            <w:shd w:val="clear" w:color="auto" w:fill="e7eaf4"/>
+            <w:tcMar>
+              <w:top w:type="dxa" w:w="0"/>
+              <w:left w:type="dxa" w:w="0"/>
+              <w:bottom w:type="dxa" w:w="0"/>
+              <w:right w:type="dxa" w:w="0"/>
+            </w:tcMar>
+            <w:vAlign w:val="top"/>
+          </w:tcPr>
+          <w:p>
+            <w:pPr>
+              <w:keepNext w:val="0"/>
+              <w:keepLines w:val="0"/>
+              <w:pageBreakBefore w:val="0"/>
+              <w:widowControl w:val="1"/>
+              <w:shd w:val="clear" w:color="auto" w:fill="auto"/>
+              <w:suppressAutoHyphens w:val="1"/>
+              <w:bidi w:val="0"/>
+              <w:spacing w:before="0" w:after="0" w:line="240" w:lineRule="auto"/>
+              <w:ind w:left="0" w:right="0" w:firstLine="0"/>
+              <w:jc w:val="left"/>
+              <w:outlineLvl w:val="0"/>
+              <w:rPr>
+                <w:rtl w:val="0"/>
+              </w:rPr>
+            </w:pPr>
+            <w:r>
+              <w:rPr>
+                <w:rFonts w:ascii="Calibri" w:cs="Arial Unicode MS" w:hAnsi="Calibri" w:eastAsia="Arial Unicode MS"/>
+                <w:b w:val="0"/>
+                <w:bCs w:val="0"/>
+                <w:i w:val="0"/>
+                <w:iCs w:val="0"/>
+                <w:caps w:val="0"/>
+                <w:smallCaps w:val="0"/>
+                <w:strike w:val="0"/>
+                <w:dstrike w:val="0"/>
+                <w:outline w:val="0"/>
+                <w:color w:val="000000"/>
+                <w:spacing w:val="0"/>
+                <w:kern w:val="0"/>
+                <w:position w:val="0"/>
+                <w:sz w:val="36"/>
+                <w:szCs w:val="36"/>
+                <w:u w:val="none"/>
+                <w:shd w:val="nil" w:color="auto" w:fill="auto"/>
+                <w:vertAlign w:val="baseline"/>
+                <w:rtl w:val="0"/>
+                <w14:textOutline w14:w="12700" w14:cap="flat">
+                  <w14:noFill/>
+                  <w14:miter w14:lim="400000"/>
+                </w14:textOutline>
+                <w14:textFill>
+                  <w14:solidFill>
+                    <w14:srgbClr w14:val="000000"/>
+                  </w14:solidFill>
+                </w14:textFill>
+              </w:rPr>
+              <w:t>Branch name</w:t>
+            </w:r>
+          </w:p>
+        </w:tc>
+        <w:tc>
+          <w:tcPr>
+            <w:tcW w:type="dxa" w:w="4670"/>
+            <w:tcBorders>
+              <w:top w:val="single" w:color="ffffff" w:sz="8" w:space="0" w:shadow="0" w:frame="0"/>
+              <w:left w:val="single" w:color="ffffff" w:sz="8" w:space="0" w:shadow="0" w:frame="0"/>
+              <w:bottom w:val="single" w:color="ffffff" w:sz="8" w:space="0" w:shadow="0" w:frame="0"/>
+              <w:right w:val="single" w:color="ffffff" w:sz="8" w:space="0" w:shadow="0" w:frame="0"/>
+            </w:tcBorders>
+            <w:shd w:val="clear" w:color="auto" w:fill="e7eaf4"/>
+            <w:tcMar>
+              <w:top w:type="dxa" w:w="0"/>
+              <w:left w:type="dxa" w:w="0"/>
+              <w:bottom w:type="dxa" w:w="0"/>
+              <w:right w:type="dxa" w:w="0"/>
+            </w:tcMar>
+            <w:vAlign w:val="top"/>
+          </w:tcPr>
+          <w:p/>
+        </w:tc>
       </w:tr>
     </w:tbl>
     <w:p>
       <w:pPr>
-        <w:pStyle w:val="Title"/>
-        <w:bidi w:val="0"/>
-        <w:rPr>
-          <w:outline w:val="0"/>
-          <w:color w:val="ee0000"/>
-          <w:u w:val="thick" w:color="ee0000"/>
-          <w14:textFill>
-            <w14:solidFill>
-              <w14:srgbClr w14:val="EE0000"/>
-            </w14:solidFill>
-          </w14:textFill>
-        </w:rPr>
+        <w:pStyle w:val="Body"/>
       </w:pPr>
     </w:p>
     <w:p>
       <w:pPr>
         <w:pStyle w:val="Heading"/>
-        <w:pBdr>
-          <w:top w:val="single" w:color="365b9c" w:sz="24" w:space="6" w:shadow="0" w:frame="0"/>
-          <w:left w:val="nil"/>
-          <w:bottom w:val="nil"/>
-          <w:right w:val="nil"/>
-        </w:pBdr>
-        <w:bidi w:val="1"/>
-        <w:ind w:left="0" w:right="0" w:firstLine="0"/>
-        <w:jc w:val="left"/>
-        <w:rPr>
-          <w:rtl w:val="1"/>
+        <w:jc w:val="right"/>
+        <w:rPr>
+          <w:rFonts w:ascii="Mj_Casablanca" w:cs="Mj_Casablanca" w:hAnsi="Mj_Casablanca" w:eastAsia="Mj_Casablanca"/>
         </w:rPr>
       </w:pPr>
       <w:r>
         <w:rPr>
-          <w:rFonts w:ascii="Arial Unicode MS" w:cs="Mj_Casablanca Light" w:hAnsi="Arial Unicode MS" w:eastAsia="Arial Unicode MS" w:hint="cs"/>
+          <w:rFonts w:ascii="Arial Unicode MS" w:cs="Mj_Casablanca" w:hAnsi="Arial Unicode MS" w:eastAsia="Arial Unicode MS" w:hint="cs"/>
           <w:rtl w:val="1"/>
         </w:rPr>
         <w:t>توضیحات</w:t>
       </w:r>
       <w:r>
         <w:rPr>
-          <w:rFonts w:ascii="Mj_Casablanca Light" w:hAnsi="Mj_Casablanca Light"/>
+          <w:rFonts w:ascii="Mj_Casablanca" w:hAnsi="Mj_Casablanca"/>
           <w:rtl w:val="1"/>
         </w:rPr>
         <w:t>:</w:t>
@@ -1195,8 +1593,6 @@
         <w:ind w:left="0" w:right="0" w:firstLine="0"/>
         <w:jc w:val="right"/>
         <w:rPr>
-          <w:rFonts w:ascii="Chalkboard SE Bold" w:cs="Chalkboard SE Bold" w:hAnsi="Chalkboard SE Bold" w:eastAsia="Chalkboard SE Bold"/>
-          <w:u w:color="ee0000"/>
           <w:rtl w:val="1"/>
         </w:rPr>
       </w:pPr>
@@ -1209,30 +1605,6 @@
         </w:rPr>
         <w:t>Priority ratings: 1. High, 2. Medium, 3. Low</w:t>
       </w:r>
-    </w:p>
-    <w:p>
-      <w:pPr>
-        <w:pStyle w:val="Body"/>
-        <w:bidi w:val="1"/>
-        <w:ind w:left="0" w:right="0" w:firstLine="0"/>
-        <w:jc w:val="right"/>
-        <w:rPr>
-          <w:rFonts w:ascii="Chalkboard SE Bold" w:cs="Chalkboard SE Bold" w:hAnsi="Chalkboard SE Bold" w:eastAsia="Chalkboard SE Bold"/>
-          <w:u w:color="ee0000"/>
-          <w:rtl w:val="1"/>
-        </w:rPr>
-      </w:pPr>
-    </w:p>
-    <w:p>
-      <w:pPr>
-        <w:pStyle w:val="Body"/>
-        <w:bidi w:val="1"/>
-        <w:ind w:left="0" w:right="0" w:firstLine="0"/>
-        <w:jc w:val="right"/>
-        <w:rPr>
-          <w:rtl w:val="1"/>
-        </w:rPr>
-      </w:pPr>
       <w:r>
         <w:rPr>
           <w:rFonts w:ascii="Arial Unicode MS" w:cs="Arial Unicode MS" w:hAnsi="Arial Unicode MS" w:eastAsia="Arial Unicode MS"/>
@@ -1248,14 +1620,8 @@
     <w:p>
       <w:pPr>
         <w:pStyle w:val="Heading"/>
-        <w:pBdr>
-          <w:top w:val="single" w:color="365b9c" w:sz="24" w:space="6" w:shadow="0" w:frame="0"/>
-          <w:left w:val="nil"/>
-          <w:bottom w:val="nil"/>
-          <w:right w:val="nil"/>
-        </w:pBdr>
-        <w:rPr>
-          <w:rFonts w:ascii="Chalkboard SE Bold" w:cs="Chalkboard SE Bold" w:hAnsi="Chalkboard SE Bold" w:eastAsia="Chalkboard SE Bold"/>
+        <w:bidi w:val="0"/>
+        <w:rPr>
           <w:sz w:val="28"/>
           <w:szCs w:val="28"/>
           <w:u w:color="ee0000"/>
@@ -1263,7 +1629,7 @@
       </w:pPr>
       <w:r>
         <w:rPr>
-          <w:rFonts w:ascii="Chalkboard SE Bold" w:hAnsi="Chalkboard SE Bold"/>
+          <w:rFonts w:ascii="Chalkboard SE Bold" w:cs="Arial Unicode MS" w:hAnsi="Chalkboard SE Bold"/>
           <w:sz w:val="28"/>
           <w:szCs w:val="28"/>
           <w:u w:color="ee0000"/>
@@ -1282,13 +1648,13 @@
         <w:rPr>
           <w:rFonts w:ascii="Chalkboard SE Regular" w:cs="Chalkboard SE Regular" w:hAnsi="Chalkboard SE Regular" w:eastAsia="Chalkboard SE Regular"/>
           <w:outline w:val="0"/>
-          <w:color w:val="4472c4"/>
+          <w:color w:val="ed7d31"/>
           <w:sz w:val="28"/>
           <w:u w:color="ee0000"/>
           <w:rtl w:val="0"/>
           <w14:textFill>
             <w14:solidFill>
-              <w14:srgbClr w14:val="4472C4"/>
+              <w14:srgbClr w14:val="ED7D31"/>
             </w14:solidFill>
           </w14:textFill>
         </w:rPr>
@@ -1302,9 +1668,9 @@
             <w:rPr xmlns:w="http://schemas.openxmlformats.org/wordprocessingml/2006/main">
               <w:rFonts w:ascii="Cambria Math" w:hAnsi="Cambria Math"/>
               <w:i/>
-              <w:color w:val="ee0000"/>
-              <w:sz w:val="23"/>
-              <w:szCs w:val="23"/>
+              <w:color w:val="ed7d31"/>
+              <w:sz w:val="24"/>
+              <w:szCs w:val="24"/>
             </w:rPr>
             <m:t>w</m:t>
           </m:r>
@@ -1312,9 +1678,9 @@
             <w:rPr xmlns:w="http://schemas.openxmlformats.org/wordprocessingml/2006/main">
               <w:rFonts w:ascii="Cambria Math" w:hAnsi="Cambria Math"/>
               <w:i/>
-              <w:color w:val="ee0000"/>
-              <w:sz w:val="23"/>
-              <w:szCs w:val="23"/>
+              <w:color w:val="ed7d31"/>
+              <w:sz w:val="24"/>
+              <w:szCs w:val="24"/>
             </w:rPr>
             <m:t>e</m:t>
           </m:r>
@@ -1322,9 +1688,9 @@
             <w:rPr xmlns:w="http://schemas.openxmlformats.org/wordprocessingml/2006/main">
               <w:rFonts w:ascii="Cambria Math" w:hAnsi="Cambria Math"/>
               <w:i/>
-              <w:color w:val="ee0000"/>
-              <w:sz w:val="23"/>
-              <w:szCs w:val="23"/>
+              <w:color w:val="ed7d31"/>
+              <w:sz w:val="24"/>
+              <w:szCs w:val="24"/>
             </w:rPr>
             <m:t>i</m:t>
           </m:r>
@@ -1332,9 +1698,9 @@
             <w:rPr xmlns:w="http://schemas.openxmlformats.org/wordprocessingml/2006/main">
               <w:rFonts w:ascii="Cambria Math" w:hAnsi="Cambria Math"/>
               <w:i/>
-              <w:color w:val="ee0000"/>
-              <w:sz w:val="23"/>
-              <w:szCs w:val="23"/>
+              <w:color w:val="ed7d31"/>
+              <w:sz w:val="24"/>
+              <w:szCs w:val="24"/>
             </w:rPr>
             <m:t>g</m:t>
           </m:r>
@@ -1342,9 +1708,9 @@
             <w:rPr xmlns:w="http://schemas.openxmlformats.org/wordprocessingml/2006/main">
               <w:rFonts w:ascii="Cambria Math" w:hAnsi="Cambria Math"/>
               <w:i/>
-              <w:color w:val="ee0000"/>
-              <w:sz w:val="23"/>
-              <w:szCs w:val="23"/>
+              <w:color w:val="ed7d31"/>
+              <w:sz w:val="24"/>
+              <w:szCs w:val="24"/>
             </w:rPr>
             <m:t>h</m:t>
           </m:r>
@@ -1352,9 +1718,9 @@
             <w:rPr xmlns:w="http://schemas.openxmlformats.org/wordprocessingml/2006/main">
               <w:rFonts w:ascii="Cambria Math" w:hAnsi="Cambria Math"/>
               <w:i/>
-              <w:color w:val="ee0000"/>
-              <w:sz w:val="23"/>
-              <w:szCs w:val="23"/>
+              <w:color w:val="ed7d31"/>
+              <w:sz w:val="24"/>
+              <w:szCs w:val="24"/>
             </w:rPr>
             <m:t>t</m:t>
           </m:r>
@@ -1362,9 +1728,9 @@
             <w:rPr xmlns:w="http://schemas.openxmlformats.org/wordprocessingml/2006/main">
               <w:rFonts w:ascii="Cambria Math" w:hAnsi="Cambria Math"/>
               <w:i/>
-              <w:color w:val="ee0000"/>
-              <w:sz w:val="23"/>
-              <w:szCs w:val="23"/>
+              <w:color w:val="ed7d31"/>
+              <w:sz w:val="24"/>
+              <w:szCs w:val="24"/>
             </w:rPr>
             <m:t>e</m:t>
           </m:r>
@@ -1372,9 +1738,9 @@
             <w:rPr xmlns:w="http://schemas.openxmlformats.org/wordprocessingml/2006/main">
               <w:rFonts w:ascii="Cambria Math" w:hAnsi="Cambria Math"/>
               <w:i/>
-              <w:color w:val="ee0000"/>
-              <w:sz w:val="23"/>
-              <w:szCs w:val="23"/>
+              <w:color w:val="ed7d31"/>
+              <w:sz w:val="24"/>
+              <w:szCs w:val="24"/>
             </w:rPr>
             <m:t>d</m:t>
           </m:r>
@@ -1382,19 +1748,49 @@
             <w:rPr xmlns:w="http://schemas.openxmlformats.org/wordprocessingml/2006/main">
               <w:rFonts w:ascii="Cambria Math" w:hAnsi="Cambria Math"/>
               <w:i/>
-              <w:color w:val="ee0000"/>
-              <w:sz w:val="23"/>
-              <w:szCs w:val="23"/>
+              <w:color w:val="ed7d31"/>
+              <w:sz w:val="24"/>
+              <w:szCs w:val="24"/>
             </w:rPr>
-            <m:t/>
+            <m:t>A</m:t>
           </m:r>
           <m:r>
             <w:rPr xmlns:w="http://schemas.openxmlformats.org/wordprocessingml/2006/main">
               <w:rFonts w:ascii="Cambria Math" w:hAnsi="Cambria Math"/>
               <w:i/>
-              <w:color w:val="ee0000"/>
-              <w:sz w:val="23"/>
-              <w:szCs w:val="23"/>
+              <w:color w:val="ed7d31"/>
+              <w:sz w:val="24"/>
+              <w:szCs w:val="24"/>
+            </w:rPr>
+            <m:t>v</m:t>
+          </m:r>
+          <m:r>
+            <w:rPr xmlns:w="http://schemas.openxmlformats.org/wordprocessingml/2006/main">
+              <w:rFonts w:ascii="Cambria Math" w:hAnsi="Cambria Math"/>
+              <w:i/>
+              <w:color w:val="ed7d31"/>
+              <w:sz w:val="24"/>
+              <w:szCs w:val="24"/>
+            </w:rPr>
+            <m:t>e</m:t>
+          </m:r>
+          <m:r>
+            <w:rPr xmlns:w="http://schemas.openxmlformats.org/wordprocessingml/2006/main">
+              <w:rFonts w:ascii="Cambria Math" w:hAnsi="Cambria Math"/>
+              <w:i/>
+              <w:color w:val="ed7d31"/>
+              <w:sz w:val="24"/>
+              <w:szCs w:val="24"/>
+            </w:rPr>
+            <m:t>r</m:t>
+          </m:r>
+          <m:r>
+            <w:rPr xmlns:w="http://schemas.openxmlformats.org/wordprocessingml/2006/main">
+              <w:rFonts w:ascii="Cambria Math" w:hAnsi="Cambria Math"/>
+              <w:i/>
+              <w:color w:val="ed7d31"/>
+              <w:sz w:val="24"/>
+              <w:szCs w:val="24"/>
             </w:rPr>
             <m:t>a</m:t>
           </m:r>
@@ -1402,19 +1798,19 @@
             <w:rPr xmlns:w="http://schemas.openxmlformats.org/wordprocessingml/2006/main">
               <w:rFonts w:ascii="Cambria Math" w:hAnsi="Cambria Math"/>
               <w:i/>
-              <w:color w:val="ee0000"/>
-              <w:sz w:val="23"/>
-              <w:szCs w:val="23"/>
+              <w:color w:val="ed7d31"/>
+              <w:sz w:val="24"/>
+              <w:szCs w:val="24"/>
             </w:rPr>
-            <m:t>v</m:t>
+            <m:t>g</m:t>
           </m:r>
           <m:r>
             <w:rPr xmlns:w="http://schemas.openxmlformats.org/wordprocessingml/2006/main">
               <w:rFonts w:ascii="Cambria Math" w:hAnsi="Cambria Math"/>
               <w:i/>
-              <w:color w:val="ee0000"/>
-              <w:sz w:val="23"/>
-              <w:szCs w:val="23"/>
+              <w:color w:val="ed7d31"/>
+              <w:sz w:val="24"/>
+              <w:szCs w:val="24"/>
             </w:rPr>
             <m:t>e</m:t>
           </m:r>
@@ -1422,61 +1818,11 @@
             <w:rPr xmlns:w="http://schemas.openxmlformats.org/wordprocessingml/2006/main">
               <w:rFonts w:ascii="Cambria Math" w:hAnsi="Cambria Math"/>
               <w:i/>
-              <w:color w:val="ee0000"/>
-              <w:sz w:val="23"/>
-              <w:szCs w:val="23"/>
-            </w:rPr>
-            <m:t>r</m:t>
-          </m:r>
-          <m:r>
-            <w:rPr xmlns:w="http://schemas.openxmlformats.org/wordprocessingml/2006/main">
-              <w:rFonts w:ascii="Cambria Math" w:hAnsi="Cambria Math"/>
-              <w:i/>
-              <w:color w:val="ee0000"/>
-              <w:sz w:val="23"/>
-              <w:szCs w:val="23"/>
-            </w:rPr>
-            <m:t>a</m:t>
-          </m:r>
-          <m:r>
-            <w:rPr xmlns:w="http://schemas.openxmlformats.org/wordprocessingml/2006/main">
-              <w:rFonts w:ascii="Cambria Math" w:hAnsi="Cambria Math"/>
-              <w:i/>
-              <w:color w:val="ee0000"/>
-              <w:sz w:val="23"/>
-              <w:szCs w:val="23"/>
-            </w:rPr>
-            <m:t>g</m:t>
-          </m:r>
-          <m:r>
-            <w:rPr xmlns:w="http://schemas.openxmlformats.org/wordprocessingml/2006/main">
-              <w:rFonts w:ascii="Cambria Math" w:hAnsi="Cambria Math"/>
-              <w:i/>
-              <w:color w:val="ee0000"/>
-              <w:sz w:val="23"/>
-              <w:szCs w:val="23"/>
-            </w:rPr>
-            <m:t>e</m:t>
-          </m:r>
-          <m:r>
-            <w:rPr xmlns:w="http://schemas.openxmlformats.org/wordprocessingml/2006/main">
-              <w:rFonts w:ascii="Cambria Math" w:hAnsi="Cambria Math"/>
-              <w:i/>
-              <w:color w:val="ee0000"/>
-              <w:sz w:val="23"/>
-              <w:szCs w:val="23"/>
+              <w:color w:val="ed7d31"/>
+              <w:sz w:val="24"/>
+              <w:szCs w:val="24"/>
             </w:rPr>
             <m:t>=</m:t>
-          </m:r>
-          <m:r>
-            <w:rPr xmlns:w="http://schemas.openxmlformats.org/wordprocessingml/2006/main">
-              <w:rFonts w:ascii="Cambria Math" w:hAnsi="Cambria Math"/>
-              <w:i/>
-              <w:color w:val="ee0000"/>
-              <w:sz w:val="23"/>
-              <w:szCs w:val="23"/>
-            </w:rPr>
-            <m:t/>
           </m:r>
           <m:f>
             <m:fPr>
@@ -1484,683 +1830,633 @@
                 <w:rPr xmlns:w="http://schemas.openxmlformats.org/wordprocessingml/2006/main">
                   <w:rFonts w:ascii="Cambria Math" w:hAnsi="Cambria Math"/>
                   <w:i/>
-                  <w:color w:val="ee0000"/>
-                  <w:sz w:val="23"/>
-                  <w:szCs w:val="23"/>
+                  <w:color w:val="ed7d31"/>
+                  <w:sz w:val="24"/>
+                  <w:szCs w:val="24"/>
                 </w:rPr>
               </m:ctrlPr>
               <m:type m:val="bar"/>
             </m:fPr>
             <m:num>
-              <m:d>
-                <m:dPr>
-                  <m:ctrlPr>
-                    <w:rPr xmlns:w="http://schemas.openxmlformats.org/wordprocessingml/2006/main">
-                      <w:rFonts w:ascii="Cambria Math" w:hAnsi="Cambria Math"/>
-                      <w:i/>
-                      <w:color w:val="ee0000"/>
-                      <w:sz w:val="23"/>
-                      <w:szCs w:val="23"/>
-                    </w:rPr>
-                  </m:ctrlPr>
-                </m:dPr>
-                <m:e>
-                  <m:r>
-                    <w:rPr xmlns:w="http://schemas.openxmlformats.org/wordprocessingml/2006/main">
-                      <w:rFonts w:ascii="Cambria Math" w:hAnsi="Cambria Math"/>
-                      <w:i/>
-                      <w:color w:val="ee0000"/>
-                      <w:sz w:val="23"/>
-                      <w:szCs w:val="23"/>
-                    </w:rPr>
-                    <m:t>o</m:t>
-                  </m:r>
-                  <m:r>
-                    <w:rPr xmlns:w="http://schemas.openxmlformats.org/wordprocessingml/2006/main">
-                      <w:rFonts w:ascii="Cambria Math" w:hAnsi="Cambria Math"/>
-                      <w:i/>
-                      <w:color w:val="ee0000"/>
-                      <w:sz w:val="23"/>
-                      <w:szCs w:val="23"/>
-                    </w:rPr>
-                    <m:t>p</m:t>
-                  </m:r>
-                  <m:r>
-                    <w:rPr xmlns:w="http://schemas.openxmlformats.org/wordprocessingml/2006/main">
-                      <w:rFonts w:ascii="Cambria Math" w:hAnsi="Cambria Math"/>
-                      <w:i/>
-                      <w:color w:val="ee0000"/>
-                      <w:sz w:val="23"/>
-                      <w:szCs w:val="23"/>
-                    </w:rPr>
-                    <m:t>t</m:t>
-                  </m:r>
-                  <m:r>
-                    <w:rPr xmlns:w="http://schemas.openxmlformats.org/wordprocessingml/2006/main">
-                      <w:rFonts w:ascii="Cambria Math" w:hAnsi="Cambria Math"/>
-                      <w:i/>
-                      <w:color w:val="ee0000"/>
-                      <w:sz w:val="23"/>
-                      <w:szCs w:val="23"/>
-                    </w:rPr>
-                    <m:t>i</m:t>
-                  </m:r>
-                  <m:r>
-                    <w:rPr xmlns:w="http://schemas.openxmlformats.org/wordprocessingml/2006/main">
-                      <w:rFonts w:ascii="Cambria Math" w:hAnsi="Cambria Math"/>
-                      <w:i/>
-                      <w:color w:val="ee0000"/>
-                      <w:sz w:val="23"/>
-                      <w:szCs w:val="23"/>
-                    </w:rPr>
-                    <m:t>m</m:t>
-                  </m:r>
-                  <m:r>
-                    <w:rPr xmlns:w="http://schemas.openxmlformats.org/wordprocessingml/2006/main">
-                      <w:rFonts w:ascii="Cambria Math" w:hAnsi="Cambria Math"/>
-                      <w:i/>
-                      <w:color w:val="ee0000"/>
-                      <w:sz w:val="23"/>
-                      <w:szCs w:val="23"/>
-                    </w:rPr>
-                    <m:t>i</m:t>
-                  </m:r>
-                  <m:r>
-                    <w:rPr xmlns:w="http://schemas.openxmlformats.org/wordprocessingml/2006/main">
-                      <w:rFonts w:ascii="Cambria Math" w:hAnsi="Cambria Math"/>
-                      <w:i/>
-                      <w:color w:val="ee0000"/>
-                      <w:sz w:val="23"/>
-                      <w:szCs w:val="23"/>
-                    </w:rPr>
-                    <m:t>s</m:t>
-                  </m:r>
-                  <m:r>
-                    <w:rPr xmlns:w="http://schemas.openxmlformats.org/wordprocessingml/2006/main">
-                      <w:rFonts w:ascii="Cambria Math" w:hAnsi="Cambria Math"/>
-                      <w:i/>
-                      <w:color w:val="ee0000"/>
-                      <w:sz w:val="23"/>
-                      <w:szCs w:val="23"/>
-                    </w:rPr>
-                    <m:t>t</m:t>
-                  </m:r>
-                  <m:r>
-                    <w:rPr xmlns:w="http://schemas.openxmlformats.org/wordprocessingml/2006/main">
-                      <w:rFonts w:ascii="Cambria Math" w:hAnsi="Cambria Math"/>
-                      <w:i/>
-                      <w:color w:val="ee0000"/>
-                      <w:sz w:val="23"/>
-                      <w:szCs w:val="23"/>
-                    </w:rPr>
-                    <m:t>i</m:t>
-                  </m:r>
-                  <m:r>
-                    <w:rPr xmlns:w="http://schemas.openxmlformats.org/wordprocessingml/2006/main">
-                      <w:rFonts w:ascii="Cambria Math" w:hAnsi="Cambria Math"/>
-                      <w:i/>
-                      <w:color w:val="ee0000"/>
-                      <w:sz w:val="23"/>
-                      <w:szCs w:val="23"/>
-                    </w:rPr>
-                    <m:t>c</m:t>
-                  </m:r>
-                  <m:r>
-                    <w:rPr xmlns:w="http://schemas.openxmlformats.org/wordprocessingml/2006/main">
-                      <w:rFonts w:ascii="Cambria Math" w:hAnsi="Cambria Math"/>
-                      <w:i/>
-                      <w:color w:val="ee0000"/>
-                      <w:sz w:val="23"/>
-                      <w:szCs w:val="23"/>
-                    </w:rPr>
-                    <m:t/>
-                  </m:r>
-                  <m:r>
-                    <w:rPr xmlns:w="http://schemas.openxmlformats.org/wordprocessingml/2006/main">
-                      <w:rFonts w:ascii="Cambria Math" w:hAnsi="Cambria Math"/>
-                      <w:i/>
-                      <w:color w:val="ee0000"/>
-                      <w:sz w:val="23"/>
-                      <w:szCs w:val="23"/>
-                    </w:rPr>
-                    <m:t>e</m:t>
-                  </m:r>
-                  <m:r>
-                    <w:rPr xmlns:w="http://schemas.openxmlformats.org/wordprocessingml/2006/main">
-                      <w:rFonts w:ascii="Cambria Math" w:hAnsi="Cambria Math"/>
-                      <w:i/>
-                      <w:color w:val="ee0000"/>
-                      <w:sz w:val="23"/>
-                      <w:szCs w:val="23"/>
-                    </w:rPr>
-                    <m:t>s</m:t>
-                  </m:r>
-                  <m:r>
-                    <w:rPr xmlns:w="http://schemas.openxmlformats.org/wordprocessingml/2006/main">
-                      <w:rFonts w:ascii="Cambria Math" w:hAnsi="Cambria Math"/>
-                      <w:i/>
-                      <w:color w:val="ee0000"/>
-                      <w:sz w:val="23"/>
-                      <w:szCs w:val="23"/>
-                    </w:rPr>
-                    <m:t>t</m:t>
-                  </m:r>
-                  <m:r>
-                    <w:rPr xmlns:w="http://schemas.openxmlformats.org/wordprocessingml/2006/main">
-                      <w:rFonts w:ascii="Cambria Math" w:hAnsi="Cambria Math"/>
-                      <w:i/>
-                      <w:color w:val="ee0000"/>
-                      <w:sz w:val="23"/>
-                      <w:szCs w:val="23"/>
-                    </w:rPr>
-                    <m:t>i</m:t>
-                  </m:r>
-                  <m:r>
-                    <w:rPr xmlns:w="http://schemas.openxmlformats.org/wordprocessingml/2006/main">
-                      <w:rFonts w:ascii="Cambria Math" w:hAnsi="Cambria Math"/>
-                      <w:i/>
-                      <w:color w:val="ee0000"/>
-                      <w:sz w:val="23"/>
-                      <w:szCs w:val="23"/>
-                    </w:rPr>
-                    <m:t>m</m:t>
-                  </m:r>
-                  <m:r>
-                    <w:rPr xmlns:w="http://schemas.openxmlformats.org/wordprocessingml/2006/main">
-                      <w:rFonts w:ascii="Cambria Math" w:hAnsi="Cambria Math"/>
-                      <w:i/>
-                      <w:color w:val="ee0000"/>
-                      <w:sz w:val="23"/>
-                      <w:szCs w:val="23"/>
-                    </w:rPr>
-                    <m:t>a</m:t>
-                  </m:r>
-                  <m:r>
-                    <w:rPr xmlns:w="http://schemas.openxmlformats.org/wordprocessingml/2006/main">
-                      <w:rFonts w:ascii="Cambria Math" w:hAnsi="Cambria Math"/>
-                      <w:i/>
-                      <w:color w:val="ee0000"/>
-                      <w:sz w:val="23"/>
-                      <w:szCs w:val="23"/>
-                    </w:rPr>
-                    <m:t>t</m:t>
-                  </m:r>
-                  <m:r>
-                    <w:rPr xmlns:w="http://schemas.openxmlformats.org/wordprocessingml/2006/main">
-                      <w:rFonts w:ascii="Cambria Math" w:hAnsi="Cambria Math"/>
-                      <w:i/>
-                      <w:color w:val="ee0000"/>
-                      <w:sz w:val="23"/>
-                      <w:szCs w:val="23"/>
-                    </w:rPr>
-                    <m:t>e</m:t>
-                  </m:r>
-                  <m:r>
-                    <w:rPr xmlns:w="http://schemas.openxmlformats.org/wordprocessingml/2006/main">
-                      <w:rFonts w:ascii="Cambria Math" w:hAnsi="Cambria Math"/>
-                      <w:i/>
-                      <w:color w:val="ee0000"/>
-                      <w:sz w:val="23"/>
-                      <w:szCs w:val="23"/>
-                    </w:rPr>
-                    <m:t>+</m:t>
-                  </m:r>
-                  <m:d>
-                    <m:dPr>
-                      <m:ctrlPr>
-                        <w:rPr xmlns:w="http://schemas.openxmlformats.org/wordprocessingml/2006/main">
-                          <w:rFonts w:ascii="Cambria Math" w:hAnsi="Cambria Math"/>
-                          <w:i/>
-                          <w:color w:val="ee0000"/>
-                          <w:sz w:val="23"/>
-                          <w:szCs w:val="23"/>
-                        </w:rPr>
-                      </m:ctrlPr>
-                    </m:dPr>
-                    <m:e>
-                      <m:r>
-                        <w:rPr xmlns:w="http://schemas.openxmlformats.org/wordprocessingml/2006/main">
-                          <w:rFonts w:ascii="Cambria Math" w:hAnsi="Cambria Math"/>
-                          <w:i/>
-                          <w:color w:val="ee0000"/>
-                          <w:sz w:val="23"/>
-                          <w:szCs w:val="23"/>
-                        </w:rPr>
-                        <m:t>4</m:t>
-                      </m:r>
-                      <m:r>
-                        <w:rPr xmlns:w="http://schemas.openxmlformats.org/wordprocessingml/2006/main">
-                          <w:rFonts w:ascii="Cambria Math" w:hAnsi="Cambria Math"/>
-                          <w:i/>
-                          <w:color w:val="ee0000"/>
-                          <w:sz w:val="23"/>
-                          <w:szCs w:val="23"/>
-                        </w:rPr>
-                        <m:t>*</m:t>
-                      </m:r>
-                      <m:r>
-                        <w:rPr xmlns:w="http://schemas.openxmlformats.org/wordprocessingml/2006/main">
-                          <w:rFonts w:ascii="Cambria Math" w:hAnsi="Cambria Math"/>
-                          <w:i/>
-                          <w:color w:val="ee0000"/>
-                          <w:sz w:val="23"/>
-                          <w:szCs w:val="23"/>
-                        </w:rPr>
-                        <m:t>m</m:t>
-                      </m:r>
-                      <m:r>
-                        <w:rPr xmlns:w="http://schemas.openxmlformats.org/wordprocessingml/2006/main">
-                          <w:rFonts w:ascii="Cambria Math" w:hAnsi="Cambria Math"/>
-                          <w:i/>
-                          <w:color w:val="ee0000"/>
-                          <w:sz w:val="23"/>
-                          <w:szCs w:val="23"/>
-                        </w:rPr>
-                        <m:t>o</m:t>
-                      </m:r>
-                      <m:r>
-                        <w:rPr xmlns:w="http://schemas.openxmlformats.org/wordprocessingml/2006/main">
-                          <w:rFonts w:ascii="Cambria Math" w:hAnsi="Cambria Math"/>
-                          <w:i/>
-                          <w:color w:val="ee0000"/>
-                          <w:sz w:val="23"/>
-                          <w:szCs w:val="23"/>
-                        </w:rPr>
-                        <m:t>s</m:t>
-                      </m:r>
-                      <m:r>
-                        <w:rPr xmlns:w="http://schemas.openxmlformats.org/wordprocessingml/2006/main">
-                          <w:rFonts w:ascii="Cambria Math" w:hAnsi="Cambria Math"/>
-                          <w:i/>
-                          <w:color w:val="ee0000"/>
-                          <w:sz w:val="23"/>
-                          <w:szCs w:val="23"/>
-                        </w:rPr>
-                        <m:t>t</m:t>
-                      </m:r>
-                      <m:r>
-                        <w:rPr xmlns:w="http://schemas.openxmlformats.org/wordprocessingml/2006/main">
-                          <w:rFonts w:ascii="Cambria Math" w:hAnsi="Cambria Math"/>
-                          <w:i/>
-                          <w:color w:val="ee0000"/>
-                          <w:sz w:val="23"/>
-                          <w:szCs w:val="23"/>
-                        </w:rPr>
-                        <m:t/>
-                      </m:r>
-                      <m:r>
-                        <w:rPr xmlns:w="http://schemas.openxmlformats.org/wordprocessingml/2006/main">
-                          <w:rFonts w:ascii="Cambria Math" w:hAnsi="Cambria Math"/>
-                          <w:i/>
-                          <w:color w:val="ee0000"/>
-                          <w:sz w:val="23"/>
-                          <w:szCs w:val="23"/>
-                        </w:rPr>
-                        <m:t>l</m:t>
-                      </m:r>
-                      <m:r>
-                        <w:rPr xmlns:w="http://schemas.openxmlformats.org/wordprocessingml/2006/main">
-                          <w:rFonts w:ascii="Cambria Math" w:hAnsi="Cambria Math"/>
-                          <w:i/>
-                          <w:color w:val="ee0000"/>
-                          <w:sz w:val="23"/>
-                          <w:szCs w:val="23"/>
-                        </w:rPr>
-                        <m:t>i</m:t>
-                      </m:r>
-                      <m:r>
-                        <w:rPr xmlns:w="http://schemas.openxmlformats.org/wordprocessingml/2006/main">
-                          <w:rFonts w:ascii="Cambria Math" w:hAnsi="Cambria Math"/>
-                          <w:i/>
-                          <w:color w:val="ee0000"/>
-                          <w:sz w:val="23"/>
-                          <w:szCs w:val="23"/>
-                        </w:rPr>
-                        <m:t>k</m:t>
-                      </m:r>
-                      <m:r>
-                        <w:rPr xmlns:w="http://schemas.openxmlformats.org/wordprocessingml/2006/main">
-                          <w:rFonts w:ascii="Cambria Math" w:hAnsi="Cambria Math"/>
-                          <w:i/>
-                          <w:color w:val="ee0000"/>
-                          <w:sz w:val="23"/>
-                          <w:szCs w:val="23"/>
-                        </w:rPr>
-                        <m:t>e</m:t>
-                      </m:r>
-                      <m:r>
-                        <w:rPr xmlns:w="http://schemas.openxmlformats.org/wordprocessingml/2006/main">
-                          <w:rFonts w:ascii="Cambria Math" w:hAnsi="Cambria Math"/>
-                          <w:i/>
-                          <w:color w:val="ee0000"/>
-                          <w:sz w:val="23"/>
-                          <w:szCs w:val="23"/>
-                        </w:rPr>
-                        <m:t>l</m:t>
-                      </m:r>
-                      <m:r>
-                        <w:rPr xmlns:w="http://schemas.openxmlformats.org/wordprocessingml/2006/main">
-                          <w:rFonts w:ascii="Cambria Math" w:hAnsi="Cambria Math"/>
-                          <w:i/>
-                          <w:color w:val="ee0000"/>
-                          <w:sz w:val="23"/>
-                          <w:szCs w:val="23"/>
-                        </w:rPr>
-                        <m:t>y</m:t>
-                      </m:r>
-                      <m:r>
-                        <w:rPr xmlns:w="http://schemas.openxmlformats.org/wordprocessingml/2006/main">
-                          <w:rFonts w:ascii="Cambria Math" w:hAnsi="Cambria Math"/>
-                          <w:i/>
-                          <w:color w:val="ee0000"/>
-                          <w:sz w:val="23"/>
-                          <w:szCs w:val="23"/>
-                        </w:rPr>
-                        <m:t/>
-                      </m:r>
-                      <m:r>
-                        <w:rPr xmlns:w="http://schemas.openxmlformats.org/wordprocessingml/2006/main">
-                          <w:rFonts w:ascii="Cambria Math" w:hAnsi="Cambria Math"/>
-                          <w:i/>
-                          <w:color w:val="ee0000"/>
-                          <w:sz w:val="23"/>
-                          <w:szCs w:val="23"/>
-                        </w:rPr>
-                        <m:t>e</m:t>
-                      </m:r>
-                      <m:r>
-                        <w:rPr xmlns:w="http://schemas.openxmlformats.org/wordprocessingml/2006/main">
-                          <w:rFonts w:ascii="Cambria Math" w:hAnsi="Cambria Math"/>
-                          <w:i/>
-                          <w:color w:val="ee0000"/>
-                          <w:sz w:val="23"/>
-                          <w:szCs w:val="23"/>
-                        </w:rPr>
-                        <m:t>s</m:t>
-                      </m:r>
-                      <m:r>
-                        <w:rPr xmlns:w="http://schemas.openxmlformats.org/wordprocessingml/2006/main">
-                          <w:rFonts w:ascii="Cambria Math" w:hAnsi="Cambria Math"/>
-                          <w:i/>
-                          <w:color w:val="ee0000"/>
-                          <w:sz w:val="23"/>
-                          <w:szCs w:val="23"/>
-                        </w:rPr>
-                        <m:t>t</m:t>
-                      </m:r>
-                      <m:r>
-                        <w:rPr xmlns:w="http://schemas.openxmlformats.org/wordprocessingml/2006/main">
-                          <w:rFonts w:ascii="Cambria Math" w:hAnsi="Cambria Math"/>
-                          <w:i/>
-                          <w:color w:val="ee0000"/>
-                          <w:sz w:val="23"/>
-                          <w:szCs w:val="23"/>
-                        </w:rPr>
-                        <m:t>i</m:t>
-                      </m:r>
-                      <m:r>
-                        <w:rPr xmlns:w="http://schemas.openxmlformats.org/wordprocessingml/2006/main">
-                          <w:rFonts w:ascii="Cambria Math" w:hAnsi="Cambria Math"/>
-                          <w:i/>
-                          <w:color w:val="ee0000"/>
-                          <w:sz w:val="23"/>
-                          <w:szCs w:val="23"/>
-                        </w:rPr>
-                        <m:t>m</m:t>
-                      </m:r>
-                      <m:r>
-                        <w:rPr xmlns:w="http://schemas.openxmlformats.org/wordprocessingml/2006/main">
-                          <w:rFonts w:ascii="Cambria Math" w:hAnsi="Cambria Math"/>
-                          <w:i/>
-                          <w:color w:val="ee0000"/>
-                          <w:sz w:val="23"/>
-                          <w:szCs w:val="23"/>
-                        </w:rPr>
-                        <m:t>a</m:t>
-                      </m:r>
-                      <m:r>
-                        <w:rPr xmlns:w="http://schemas.openxmlformats.org/wordprocessingml/2006/main">
-                          <w:rFonts w:ascii="Cambria Math" w:hAnsi="Cambria Math"/>
-                          <w:i/>
-                          <w:color w:val="ee0000"/>
-                          <w:sz w:val="23"/>
-                          <w:szCs w:val="23"/>
-                        </w:rPr>
-                        <m:t>t</m:t>
-                      </m:r>
-                      <m:r>
-                        <w:rPr xmlns:w="http://schemas.openxmlformats.org/wordprocessingml/2006/main">
-                          <w:rFonts w:ascii="Cambria Math" w:hAnsi="Cambria Math"/>
-                          <w:i/>
-                          <w:color w:val="ee0000"/>
-                          <w:sz w:val="23"/>
-                          <w:szCs w:val="23"/>
-                        </w:rPr>
-                        <m:t>e</m:t>
-                      </m:r>
-                    </m:e>
-                  </m:d>
-                  <m:r>
-                    <w:rPr xmlns:w="http://schemas.openxmlformats.org/wordprocessingml/2006/main">
-                      <w:rFonts w:ascii="Cambria Math" w:hAnsi="Cambria Math"/>
-                      <w:i/>
-                      <w:color w:val="ee0000"/>
-                      <w:sz w:val="23"/>
-                      <w:szCs w:val="23"/>
-                    </w:rPr>
-                    <m:t>+</m:t>
-                  </m:r>
-                  <m:r>
-                    <w:rPr xmlns:w="http://schemas.openxmlformats.org/wordprocessingml/2006/main">
-                      <w:rFonts w:ascii="Cambria Math" w:hAnsi="Cambria Math"/>
-                      <w:i/>
-                      <w:color w:val="ee0000"/>
-                      <w:sz w:val="23"/>
-                      <w:szCs w:val="23"/>
-                    </w:rPr>
-                    <m:t>p</m:t>
-                  </m:r>
-                  <m:r>
-                    <w:rPr xmlns:w="http://schemas.openxmlformats.org/wordprocessingml/2006/main">
-                      <w:rFonts w:ascii="Cambria Math" w:hAnsi="Cambria Math"/>
-                      <w:i/>
-                      <w:color w:val="ee0000"/>
-                      <w:sz w:val="23"/>
-                      <w:szCs w:val="23"/>
-                    </w:rPr>
-                    <m:t>e</m:t>
-                  </m:r>
-                  <m:r>
-                    <w:rPr xmlns:w="http://schemas.openxmlformats.org/wordprocessingml/2006/main">
-                      <w:rFonts w:ascii="Cambria Math" w:hAnsi="Cambria Math"/>
-                      <w:i/>
-                      <w:color w:val="ee0000"/>
-                      <w:sz w:val="23"/>
-                      <w:szCs w:val="23"/>
-                    </w:rPr>
-                    <m:t>s</m:t>
-                  </m:r>
-                  <m:r>
-                    <w:rPr xmlns:w="http://schemas.openxmlformats.org/wordprocessingml/2006/main">
-                      <w:rFonts w:ascii="Cambria Math" w:hAnsi="Cambria Math"/>
-                      <w:i/>
-                      <w:color w:val="ee0000"/>
-                      <w:sz w:val="23"/>
-                      <w:szCs w:val="23"/>
-                    </w:rPr>
-                    <m:t>s</m:t>
-                  </m:r>
-                  <m:r>
-                    <w:rPr xmlns:w="http://schemas.openxmlformats.org/wordprocessingml/2006/main">
-                      <w:rFonts w:ascii="Cambria Math" w:hAnsi="Cambria Math"/>
-                      <w:i/>
-                      <w:color w:val="ee0000"/>
-                      <w:sz w:val="23"/>
-                      <w:szCs w:val="23"/>
-                    </w:rPr>
-                    <m:t>i</m:t>
-                  </m:r>
-                  <m:r>
-                    <w:rPr xmlns:w="http://schemas.openxmlformats.org/wordprocessingml/2006/main">
-                      <w:rFonts w:ascii="Cambria Math" w:hAnsi="Cambria Math"/>
-                      <w:i/>
-                      <w:color w:val="ee0000"/>
-                      <w:sz w:val="23"/>
-                      <w:szCs w:val="23"/>
-                    </w:rPr>
-                    <m:t>m</m:t>
-                  </m:r>
-                  <m:r>
-                    <w:rPr xmlns:w="http://schemas.openxmlformats.org/wordprocessingml/2006/main">
-                      <w:rFonts w:ascii="Cambria Math" w:hAnsi="Cambria Math"/>
-                      <w:i/>
-                      <w:color w:val="ee0000"/>
-                      <w:sz w:val="23"/>
-                      <w:szCs w:val="23"/>
-                    </w:rPr>
-                    <m:t>i</m:t>
-                  </m:r>
-                  <m:r>
-                    <w:rPr xmlns:w="http://schemas.openxmlformats.org/wordprocessingml/2006/main">
-                      <w:rFonts w:ascii="Cambria Math" w:hAnsi="Cambria Math"/>
-                      <w:i/>
-                      <w:color w:val="ee0000"/>
-                      <w:sz w:val="23"/>
-                      <w:szCs w:val="23"/>
-                    </w:rPr>
-                    <m:t>s</m:t>
-                  </m:r>
-                  <m:r>
-                    <w:rPr xmlns:w="http://schemas.openxmlformats.org/wordprocessingml/2006/main">
-                      <w:rFonts w:ascii="Cambria Math" w:hAnsi="Cambria Math"/>
-                      <w:i/>
-                      <w:color w:val="ee0000"/>
-                      <w:sz w:val="23"/>
-                      <w:szCs w:val="23"/>
-                    </w:rPr>
-                    <m:t>t</m:t>
-                  </m:r>
-                  <m:r>
-                    <w:rPr xmlns:w="http://schemas.openxmlformats.org/wordprocessingml/2006/main">
-                      <w:rFonts w:ascii="Cambria Math" w:hAnsi="Cambria Math"/>
-                      <w:i/>
-                      <w:color w:val="ee0000"/>
-                      <w:sz w:val="23"/>
-                      <w:szCs w:val="23"/>
-                    </w:rPr>
-                    <m:t>i</m:t>
-                  </m:r>
-                  <m:r>
-                    <w:rPr xmlns:w="http://schemas.openxmlformats.org/wordprocessingml/2006/main">
-                      <w:rFonts w:ascii="Cambria Math" w:hAnsi="Cambria Math"/>
-                      <w:i/>
-                      <w:color w:val="ee0000"/>
-                      <w:sz w:val="23"/>
-                      <w:szCs w:val="23"/>
-                    </w:rPr>
-                    <m:t>c</m:t>
-                  </m:r>
-                  <m:r>
-                    <w:rPr xmlns:w="http://schemas.openxmlformats.org/wordprocessingml/2006/main">
-                      <w:rFonts w:ascii="Cambria Math" w:hAnsi="Cambria Math"/>
-                      <w:i/>
-                      <w:color w:val="ee0000"/>
-                      <w:sz w:val="23"/>
-                      <w:szCs w:val="23"/>
-                    </w:rPr>
-                    <m:t/>
-                  </m:r>
-                  <m:r>
-                    <w:rPr xmlns:w="http://schemas.openxmlformats.org/wordprocessingml/2006/main">
-                      <w:rFonts w:ascii="Cambria Math" w:hAnsi="Cambria Math"/>
-                      <w:i/>
-                      <w:color w:val="ee0000"/>
-                      <w:sz w:val="23"/>
-                      <w:szCs w:val="23"/>
-                    </w:rPr>
-                    <m:t>e</m:t>
-                  </m:r>
-                  <m:r>
-                    <w:rPr xmlns:w="http://schemas.openxmlformats.org/wordprocessingml/2006/main">
-                      <w:rFonts w:ascii="Cambria Math" w:hAnsi="Cambria Math"/>
-                      <w:i/>
-                      <w:color w:val="ee0000"/>
-                      <w:sz w:val="23"/>
-                      <w:szCs w:val="23"/>
-                    </w:rPr>
-                    <m:t>s</m:t>
-                  </m:r>
-                  <m:r>
-                    <w:rPr xmlns:w="http://schemas.openxmlformats.org/wordprocessingml/2006/main">
-                      <w:rFonts w:ascii="Cambria Math" w:hAnsi="Cambria Math"/>
-                      <w:i/>
-                      <w:color w:val="ee0000"/>
-                      <w:sz w:val="23"/>
-                      <w:szCs w:val="23"/>
-                    </w:rPr>
-                    <m:t>t</m:t>
-                  </m:r>
-                  <m:r>
-                    <w:rPr xmlns:w="http://schemas.openxmlformats.org/wordprocessingml/2006/main">
-                      <w:rFonts w:ascii="Cambria Math" w:hAnsi="Cambria Math"/>
-                      <w:i/>
-                      <w:color w:val="ee0000"/>
-                      <w:sz w:val="23"/>
-                      <w:szCs w:val="23"/>
-                    </w:rPr>
-                    <m:t>i</m:t>
-                  </m:r>
-                  <m:r>
-                    <w:rPr xmlns:w="http://schemas.openxmlformats.org/wordprocessingml/2006/main">
-                      <w:rFonts w:ascii="Cambria Math" w:hAnsi="Cambria Math"/>
-                      <w:i/>
-                      <w:color w:val="ee0000"/>
-                      <w:sz w:val="23"/>
-                      <w:szCs w:val="23"/>
-                    </w:rPr>
-                    <m:t>m</m:t>
-                  </m:r>
-                  <m:r>
-                    <w:rPr xmlns:w="http://schemas.openxmlformats.org/wordprocessingml/2006/main">
-                      <w:rFonts w:ascii="Cambria Math" w:hAnsi="Cambria Math"/>
-                      <w:i/>
-                      <w:color w:val="ee0000"/>
-                      <w:sz w:val="23"/>
-                      <w:szCs w:val="23"/>
-                    </w:rPr>
-                    <m:t>a</m:t>
-                  </m:r>
-                  <m:r>
-                    <w:rPr xmlns:w="http://schemas.openxmlformats.org/wordprocessingml/2006/main">
-                      <w:rFonts w:ascii="Cambria Math" w:hAnsi="Cambria Math"/>
-                      <w:i/>
-                      <w:color w:val="ee0000"/>
-                      <w:sz w:val="23"/>
-                      <w:szCs w:val="23"/>
-                    </w:rPr>
-                    <m:t>t</m:t>
-                  </m:r>
-                  <m:r>
-                    <w:rPr xmlns:w="http://schemas.openxmlformats.org/wordprocessingml/2006/main">
-                      <w:rFonts w:ascii="Cambria Math" w:hAnsi="Cambria Math"/>
-                      <w:i/>
-                      <w:color w:val="ee0000"/>
-                      <w:sz w:val="23"/>
-                      <w:szCs w:val="23"/>
-                    </w:rPr>
-                    <m:t>e</m:t>
-                  </m:r>
-                </m:e>
-              </m:d>
+              <m:r>
+                <w:rPr xmlns:w="http://schemas.openxmlformats.org/wordprocessingml/2006/main">
+                  <w:rFonts w:ascii="Cambria Math" w:hAnsi="Cambria Math"/>
+                  <w:i/>
+                  <w:color w:val="ed7d31"/>
+                  <w:sz w:val="24"/>
+                  <w:szCs w:val="24"/>
+                </w:rPr>
+                <m:t>o</m:t>
+              </m:r>
+              <m:r>
+                <w:rPr xmlns:w="http://schemas.openxmlformats.org/wordprocessingml/2006/main">
+                  <w:rFonts w:ascii="Cambria Math" w:hAnsi="Cambria Math"/>
+                  <w:i/>
+                  <w:color w:val="ed7d31"/>
+                  <w:sz w:val="24"/>
+                  <w:szCs w:val="24"/>
+                </w:rPr>
+                <m:t>p</m:t>
+              </m:r>
+              <m:r>
+                <w:rPr xmlns:w="http://schemas.openxmlformats.org/wordprocessingml/2006/main">
+                  <w:rFonts w:ascii="Cambria Math" w:hAnsi="Cambria Math"/>
+                  <w:i/>
+                  <w:color w:val="ed7d31"/>
+                  <w:sz w:val="24"/>
+                  <w:szCs w:val="24"/>
+                </w:rPr>
+                <m:t>t</m:t>
+              </m:r>
+              <m:r>
+                <w:rPr xmlns:w="http://schemas.openxmlformats.org/wordprocessingml/2006/main">
+                  <w:rFonts w:ascii="Cambria Math" w:hAnsi="Cambria Math"/>
+                  <w:i/>
+                  <w:color w:val="ed7d31"/>
+                  <w:sz w:val="24"/>
+                  <w:szCs w:val="24"/>
+                </w:rPr>
+                <m:t>i</m:t>
+              </m:r>
+              <m:r>
+                <w:rPr xmlns:w="http://schemas.openxmlformats.org/wordprocessingml/2006/main">
+                  <w:rFonts w:ascii="Cambria Math" w:hAnsi="Cambria Math"/>
+                  <w:i/>
+                  <w:color w:val="ed7d31"/>
+                  <w:sz w:val="24"/>
+                  <w:szCs w:val="24"/>
+                </w:rPr>
+                <m:t>m</m:t>
+              </m:r>
+              <m:r>
+                <w:rPr xmlns:w="http://schemas.openxmlformats.org/wordprocessingml/2006/main">
+                  <w:rFonts w:ascii="Cambria Math" w:hAnsi="Cambria Math"/>
+                  <w:i/>
+                  <w:color w:val="ed7d31"/>
+                  <w:sz w:val="24"/>
+                  <w:szCs w:val="24"/>
+                </w:rPr>
+                <m:t>i</m:t>
+              </m:r>
+              <m:r>
+                <w:rPr xmlns:w="http://schemas.openxmlformats.org/wordprocessingml/2006/main">
+                  <w:rFonts w:ascii="Cambria Math" w:hAnsi="Cambria Math"/>
+                  <w:i/>
+                  <w:color w:val="ed7d31"/>
+                  <w:sz w:val="24"/>
+                  <w:szCs w:val="24"/>
+                </w:rPr>
+                <m:t>s</m:t>
+              </m:r>
+              <m:r>
+                <w:rPr xmlns:w="http://schemas.openxmlformats.org/wordprocessingml/2006/main">
+                  <w:rFonts w:ascii="Cambria Math" w:hAnsi="Cambria Math"/>
+                  <w:i/>
+                  <w:color w:val="ed7d31"/>
+                  <w:sz w:val="24"/>
+                  <w:szCs w:val="24"/>
+                </w:rPr>
+                <m:t>t</m:t>
+              </m:r>
+              <m:r>
+                <w:rPr xmlns:w="http://schemas.openxmlformats.org/wordprocessingml/2006/main">
+                  <w:rFonts w:ascii="Cambria Math" w:hAnsi="Cambria Math"/>
+                  <w:i/>
+                  <w:color w:val="ed7d31"/>
+                  <w:sz w:val="24"/>
+                  <w:szCs w:val="24"/>
+                </w:rPr>
+                <m:t>i</m:t>
+              </m:r>
+              <m:r>
+                <w:rPr xmlns:w="http://schemas.openxmlformats.org/wordprocessingml/2006/main">
+                  <w:rFonts w:ascii="Cambria Math" w:hAnsi="Cambria Math"/>
+                  <w:i/>
+                  <w:color w:val="ed7d31"/>
+                  <w:sz w:val="24"/>
+                  <w:szCs w:val="24"/>
+                </w:rPr>
+                <m:t>c</m:t>
+              </m:r>
+              <m:r>
+                <w:rPr xmlns:w="http://schemas.openxmlformats.org/wordprocessingml/2006/main">
+                  <w:rFonts w:ascii="Cambria Math" w:hAnsi="Cambria Math"/>
+                  <w:i/>
+                  <w:color w:val="ed7d31"/>
+                  <w:sz w:val="24"/>
+                  <w:szCs w:val="24"/>
+                </w:rPr>
+                <m:t>E</m:t>
+              </m:r>
+              <m:r>
+                <w:rPr xmlns:w="http://schemas.openxmlformats.org/wordprocessingml/2006/main">
+                  <w:rFonts w:ascii="Cambria Math" w:hAnsi="Cambria Math"/>
+                  <w:i/>
+                  <w:color w:val="ed7d31"/>
+                  <w:sz w:val="24"/>
+                  <w:szCs w:val="24"/>
+                </w:rPr>
+                <m:t>s</m:t>
+              </m:r>
+              <m:r>
+                <w:rPr xmlns:w="http://schemas.openxmlformats.org/wordprocessingml/2006/main">
+                  <w:rFonts w:ascii="Cambria Math" w:hAnsi="Cambria Math"/>
+                  <w:i/>
+                  <w:color w:val="ed7d31"/>
+                  <w:sz w:val="24"/>
+                  <w:szCs w:val="24"/>
+                </w:rPr>
+                <m:t>t</m:t>
+              </m:r>
+              <m:r>
+                <w:rPr xmlns:w="http://schemas.openxmlformats.org/wordprocessingml/2006/main">
+                  <w:rFonts w:ascii="Cambria Math" w:hAnsi="Cambria Math"/>
+                  <w:i/>
+                  <w:color w:val="ed7d31"/>
+                  <w:sz w:val="24"/>
+                  <w:szCs w:val="24"/>
+                </w:rPr>
+                <m:t>i</m:t>
+              </m:r>
+              <m:r>
+                <w:rPr xmlns:w="http://schemas.openxmlformats.org/wordprocessingml/2006/main">
+                  <w:rFonts w:ascii="Cambria Math" w:hAnsi="Cambria Math"/>
+                  <w:i/>
+                  <w:color w:val="ed7d31"/>
+                  <w:sz w:val="24"/>
+                  <w:szCs w:val="24"/>
+                </w:rPr>
+                <m:t>m</m:t>
+              </m:r>
+              <m:r>
+                <w:rPr xmlns:w="http://schemas.openxmlformats.org/wordprocessingml/2006/main">
+                  <w:rFonts w:ascii="Cambria Math" w:hAnsi="Cambria Math"/>
+                  <w:i/>
+                  <w:color w:val="ed7d31"/>
+                  <w:sz w:val="24"/>
+                  <w:szCs w:val="24"/>
+                </w:rPr>
+                <m:t>a</m:t>
+              </m:r>
+              <m:r>
+                <w:rPr xmlns:w="http://schemas.openxmlformats.org/wordprocessingml/2006/main">
+                  <w:rFonts w:ascii="Cambria Math" w:hAnsi="Cambria Math"/>
+                  <w:i/>
+                  <w:color w:val="ed7d31"/>
+                  <w:sz w:val="24"/>
+                  <w:szCs w:val="24"/>
+                </w:rPr>
+                <m:t>t</m:t>
+              </m:r>
+              <m:r>
+                <w:rPr xmlns:w="http://schemas.openxmlformats.org/wordprocessingml/2006/main">
+                  <w:rFonts w:ascii="Cambria Math" w:hAnsi="Cambria Math"/>
+                  <w:i/>
+                  <w:color w:val="ed7d31"/>
+                  <w:sz w:val="24"/>
+                  <w:szCs w:val="24"/>
+                </w:rPr>
+                <m:t>e</m:t>
+              </m:r>
+              <m:r>
+                <w:rPr xmlns:w="http://schemas.openxmlformats.org/wordprocessingml/2006/main">
+                  <w:rFonts w:ascii="Cambria Math" w:hAnsi="Cambria Math"/>
+                  <w:i/>
+                  <w:color w:val="ed7d31"/>
+                  <w:sz w:val="24"/>
+                  <w:szCs w:val="24"/>
+                </w:rPr>
+                <m:t>+</m:t>
+              </m:r>
+              <m:r>
+                <w:rPr xmlns:w="http://schemas.openxmlformats.org/wordprocessingml/2006/main">
+                  <w:rFonts w:ascii="Cambria Math" w:hAnsi="Cambria Math"/>
+                  <w:i/>
+                  <w:color w:val="ed7d31"/>
+                  <w:sz w:val="24"/>
+                  <w:szCs w:val="24"/>
+                </w:rPr>
+                <m:t>(</m:t>
+              </m:r>
+              <m:r>
+                <w:rPr xmlns:w="http://schemas.openxmlformats.org/wordprocessingml/2006/main">
+                  <w:rFonts w:ascii="Cambria Math" w:hAnsi="Cambria Math"/>
+                  <w:i/>
+                  <w:color w:val="ed7d31"/>
+                  <w:sz w:val="24"/>
+                  <w:szCs w:val="24"/>
+                </w:rPr>
+                <m:t>4</m:t>
+              </m:r>
+              <m:r>
+                <w:rPr xmlns:w="http://schemas.openxmlformats.org/wordprocessingml/2006/main">
+                  <w:rFonts w:ascii="Cambria Math" w:hAnsi="Cambria Math"/>
+                  <w:i/>
+                  <w:color w:val="ed7d31"/>
+                  <w:sz w:val="24"/>
+                  <w:szCs w:val="24"/>
+                </w:rPr>
+                <m:t>×</m:t>
+              </m:r>
+              <m:r>
+                <w:rPr xmlns:w="http://schemas.openxmlformats.org/wordprocessingml/2006/main">
+                  <w:rFonts w:ascii="Cambria Math" w:hAnsi="Cambria Math"/>
+                  <w:i/>
+                  <w:color w:val="ed7d31"/>
+                  <w:sz w:val="24"/>
+                  <w:szCs w:val="24"/>
+                </w:rPr>
+                <m:t>m</m:t>
+              </m:r>
+              <m:r>
+                <w:rPr xmlns:w="http://schemas.openxmlformats.org/wordprocessingml/2006/main">
+                  <w:rFonts w:ascii="Cambria Math" w:hAnsi="Cambria Math"/>
+                  <w:i/>
+                  <w:color w:val="ed7d31"/>
+                  <w:sz w:val="24"/>
+                  <w:szCs w:val="24"/>
+                </w:rPr>
+                <m:t>o</m:t>
+              </m:r>
+              <m:r>
+                <w:rPr xmlns:w="http://schemas.openxmlformats.org/wordprocessingml/2006/main">
+                  <w:rFonts w:ascii="Cambria Math" w:hAnsi="Cambria Math"/>
+                  <w:i/>
+                  <w:color w:val="ed7d31"/>
+                  <w:sz w:val="24"/>
+                  <w:szCs w:val="24"/>
+                </w:rPr>
+                <m:t>s</m:t>
+              </m:r>
+              <m:r>
+                <w:rPr xmlns:w="http://schemas.openxmlformats.org/wordprocessingml/2006/main">
+                  <w:rFonts w:ascii="Cambria Math" w:hAnsi="Cambria Math"/>
+                  <w:i/>
+                  <w:color w:val="ed7d31"/>
+                  <w:sz w:val="24"/>
+                  <w:szCs w:val="24"/>
+                </w:rPr>
+                <m:t>t</m:t>
+              </m:r>
+              <m:r>
+                <w:rPr xmlns:w="http://schemas.openxmlformats.org/wordprocessingml/2006/main">
+                  <w:rFonts w:ascii="Cambria Math" w:hAnsi="Cambria Math"/>
+                  <w:i/>
+                  <w:color w:val="ed7d31"/>
+                  <w:sz w:val="24"/>
+                  <w:szCs w:val="24"/>
+                </w:rPr>
+                <m:t>L</m:t>
+              </m:r>
+              <m:r>
+                <w:rPr xmlns:w="http://schemas.openxmlformats.org/wordprocessingml/2006/main">
+                  <w:rFonts w:ascii="Cambria Math" w:hAnsi="Cambria Math"/>
+                  <w:i/>
+                  <w:color w:val="ed7d31"/>
+                  <w:sz w:val="24"/>
+                  <w:szCs w:val="24"/>
+                </w:rPr>
+                <m:t>i</m:t>
+              </m:r>
+              <m:r>
+                <w:rPr xmlns:w="http://schemas.openxmlformats.org/wordprocessingml/2006/main">
+                  <w:rFonts w:ascii="Cambria Math" w:hAnsi="Cambria Math"/>
+                  <w:i/>
+                  <w:color w:val="ed7d31"/>
+                  <w:sz w:val="24"/>
+                  <w:szCs w:val="24"/>
+                </w:rPr>
+                <m:t>k</m:t>
+              </m:r>
+              <m:r>
+                <w:rPr xmlns:w="http://schemas.openxmlformats.org/wordprocessingml/2006/main">
+                  <w:rFonts w:ascii="Cambria Math" w:hAnsi="Cambria Math"/>
+                  <w:i/>
+                  <w:color w:val="ed7d31"/>
+                  <w:sz w:val="24"/>
+                  <w:szCs w:val="24"/>
+                </w:rPr>
+                <m:t>e</m:t>
+              </m:r>
+              <m:r>
+                <w:rPr xmlns:w="http://schemas.openxmlformats.org/wordprocessingml/2006/main">
+                  <w:rFonts w:ascii="Cambria Math" w:hAnsi="Cambria Math"/>
+                  <w:i/>
+                  <w:color w:val="ed7d31"/>
+                  <w:sz w:val="24"/>
+                  <w:szCs w:val="24"/>
+                </w:rPr>
+                <m:t>l</m:t>
+              </m:r>
+              <m:r>
+                <w:rPr xmlns:w="http://schemas.openxmlformats.org/wordprocessingml/2006/main">
+                  <w:rFonts w:ascii="Cambria Math" w:hAnsi="Cambria Math"/>
+                  <w:i/>
+                  <w:color w:val="ed7d31"/>
+                  <w:sz w:val="24"/>
+                  <w:szCs w:val="24"/>
+                </w:rPr>
+                <m:t>y</m:t>
+              </m:r>
+              <m:r>
+                <w:rPr xmlns:w="http://schemas.openxmlformats.org/wordprocessingml/2006/main">
+                  <w:rFonts w:ascii="Cambria Math" w:hAnsi="Cambria Math"/>
+                  <w:i/>
+                  <w:color w:val="ed7d31"/>
+                  <w:sz w:val="24"/>
+                  <w:szCs w:val="24"/>
+                </w:rPr>
+                <m:t>E</m:t>
+              </m:r>
+              <m:r>
+                <w:rPr xmlns:w="http://schemas.openxmlformats.org/wordprocessingml/2006/main">
+                  <w:rFonts w:ascii="Cambria Math" w:hAnsi="Cambria Math"/>
+                  <w:i/>
+                  <w:color w:val="ed7d31"/>
+                  <w:sz w:val="24"/>
+                  <w:szCs w:val="24"/>
+                </w:rPr>
+                <m:t>s</m:t>
+              </m:r>
+              <m:r>
+                <w:rPr xmlns:w="http://schemas.openxmlformats.org/wordprocessingml/2006/main">
+                  <w:rFonts w:ascii="Cambria Math" w:hAnsi="Cambria Math"/>
+                  <w:i/>
+                  <w:color w:val="ed7d31"/>
+                  <w:sz w:val="24"/>
+                  <w:szCs w:val="24"/>
+                </w:rPr>
+                <m:t>t</m:t>
+              </m:r>
+              <m:r>
+                <w:rPr xmlns:w="http://schemas.openxmlformats.org/wordprocessingml/2006/main">
+                  <w:rFonts w:ascii="Cambria Math" w:hAnsi="Cambria Math"/>
+                  <w:i/>
+                  <w:color w:val="ed7d31"/>
+                  <w:sz w:val="24"/>
+                  <w:szCs w:val="24"/>
+                </w:rPr>
+                <m:t>i</m:t>
+              </m:r>
+              <m:r>
+                <w:rPr xmlns:w="http://schemas.openxmlformats.org/wordprocessingml/2006/main">
+                  <w:rFonts w:ascii="Cambria Math" w:hAnsi="Cambria Math"/>
+                  <w:i/>
+                  <w:color w:val="ed7d31"/>
+                  <w:sz w:val="24"/>
+                  <w:szCs w:val="24"/>
+                </w:rPr>
+                <m:t>m</m:t>
+              </m:r>
+              <m:r>
+                <w:rPr xmlns:w="http://schemas.openxmlformats.org/wordprocessingml/2006/main">
+                  <w:rFonts w:ascii="Cambria Math" w:hAnsi="Cambria Math"/>
+                  <w:i/>
+                  <w:color w:val="ed7d31"/>
+                  <w:sz w:val="24"/>
+                  <w:szCs w:val="24"/>
+                </w:rPr>
+                <m:t>a</m:t>
+              </m:r>
+              <m:r>
+                <w:rPr xmlns:w="http://schemas.openxmlformats.org/wordprocessingml/2006/main">
+                  <w:rFonts w:ascii="Cambria Math" w:hAnsi="Cambria Math"/>
+                  <w:i/>
+                  <w:color w:val="ed7d31"/>
+                  <w:sz w:val="24"/>
+                  <w:szCs w:val="24"/>
+                </w:rPr>
+                <m:t>t</m:t>
+              </m:r>
+              <m:r>
+                <w:rPr xmlns:w="http://schemas.openxmlformats.org/wordprocessingml/2006/main">
+                  <w:rFonts w:ascii="Cambria Math" w:hAnsi="Cambria Math"/>
+                  <w:i/>
+                  <w:color w:val="ed7d31"/>
+                  <w:sz w:val="24"/>
+                  <w:szCs w:val="24"/>
+                </w:rPr>
+                <m:t>e</m:t>
+              </m:r>
+              <m:r>
+                <w:rPr xmlns:w="http://schemas.openxmlformats.org/wordprocessingml/2006/main">
+                  <w:rFonts w:ascii="Cambria Math" w:hAnsi="Cambria Math"/>
+                  <w:i/>
+                  <w:color w:val="ed7d31"/>
+                  <w:sz w:val="24"/>
+                  <w:szCs w:val="24"/>
+                </w:rPr>
+                <m:t>)</m:t>
+              </m:r>
+              <m:r>
+                <w:rPr xmlns:w="http://schemas.openxmlformats.org/wordprocessingml/2006/main">
+                  <w:rFonts w:ascii="Cambria Math" w:hAnsi="Cambria Math"/>
+                  <w:i/>
+                  <w:color w:val="ed7d31"/>
+                  <w:sz w:val="24"/>
+                  <w:szCs w:val="24"/>
+                </w:rPr>
+                <m:t>+</m:t>
+              </m:r>
+              <m:r>
+                <w:rPr xmlns:w="http://schemas.openxmlformats.org/wordprocessingml/2006/main">
+                  <w:rFonts w:ascii="Cambria Math" w:hAnsi="Cambria Math"/>
+                  <w:i/>
+                  <w:color w:val="ed7d31"/>
+                  <w:sz w:val="24"/>
+                  <w:szCs w:val="24"/>
+                </w:rPr>
+                <m:t>p</m:t>
+              </m:r>
+              <m:r>
+                <w:rPr xmlns:w="http://schemas.openxmlformats.org/wordprocessingml/2006/main">
+                  <w:rFonts w:ascii="Cambria Math" w:hAnsi="Cambria Math"/>
+                  <w:i/>
+                  <w:color w:val="ed7d31"/>
+                  <w:sz w:val="24"/>
+                  <w:szCs w:val="24"/>
+                </w:rPr>
+                <m:t>e</m:t>
+              </m:r>
+              <m:r>
+                <w:rPr xmlns:w="http://schemas.openxmlformats.org/wordprocessingml/2006/main">
+                  <w:rFonts w:ascii="Cambria Math" w:hAnsi="Cambria Math"/>
+                  <w:i/>
+                  <w:color w:val="ed7d31"/>
+                  <w:sz w:val="24"/>
+                  <w:szCs w:val="24"/>
+                </w:rPr>
+                <m:t>s</m:t>
+              </m:r>
+              <m:r>
+                <w:rPr xmlns:w="http://schemas.openxmlformats.org/wordprocessingml/2006/main">
+                  <w:rFonts w:ascii="Cambria Math" w:hAnsi="Cambria Math"/>
+                  <w:i/>
+                  <w:color w:val="ed7d31"/>
+                  <w:sz w:val="24"/>
+                  <w:szCs w:val="24"/>
+                </w:rPr>
+                <m:t>s</m:t>
+              </m:r>
+              <m:r>
+                <w:rPr xmlns:w="http://schemas.openxmlformats.org/wordprocessingml/2006/main">
+                  <w:rFonts w:ascii="Cambria Math" w:hAnsi="Cambria Math"/>
+                  <w:i/>
+                  <w:color w:val="ed7d31"/>
+                  <w:sz w:val="24"/>
+                  <w:szCs w:val="24"/>
+                </w:rPr>
+                <m:t>i</m:t>
+              </m:r>
+              <m:r>
+                <w:rPr xmlns:w="http://schemas.openxmlformats.org/wordprocessingml/2006/main">
+                  <w:rFonts w:ascii="Cambria Math" w:hAnsi="Cambria Math"/>
+                  <w:i/>
+                  <w:color w:val="ed7d31"/>
+                  <w:sz w:val="24"/>
+                  <w:szCs w:val="24"/>
+                </w:rPr>
+                <m:t>m</m:t>
+              </m:r>
+              <m:r>
+                <w:rPr xmlns:w="http://schemas.openxmlformats.org/wordprocessingml/2006/main">
+                  <w:rFonts w:ascii="Cambria Math" w:hAnsi="Cambria Math"/>
+                  <w:i/>
+                  <w:color w:val="ed7d31"/>
+                  <w:sz w:val="24"/>
+                  <w:szCs w:val="24"/>
+                </w:rPr>
+                <m:t>i</m:t>
+              </m:r>
+              <m:r>
+                <w:rPr xmlns:w="http://schemas.openxmlformats.org/wordprocessingml/2006/main">
+                  <w:rFonts w:ascii="Cambria Math" w:hAnsi="Cambria Math"/>
+                  <w:i/>
+                  <w:color w:val="ed7d31"/>
+                  <w:sz w:val="24"/>
+                  <w:szCs w:val="24"/>
+                </w:rPr>
+                <m:t>s</m:t>
+              </m:r>
+              <m:r>
+                <w:rPr xmlns:w="http://schemas.openxmlformats.org/wordprocessingml/2006/main">
+                  <w:rFonts w:ascii="Cambria Math" w:hAnsi="Cambria Math"/>
+                  <w:i/>
+                  <w:color w:val="ed7d31"/>
+                  <w:sz w:val="24"/>
+                  <w:szCs w:val="24"/>
+                </w:rPr>
+                <m:t>t</m:t>
+              </m:r>
+              <m:r>
+                <w:rPr xmlns:w="http://schemas.openxmlformats.org/wordprocessingml/2006/main">
+                  <w:rFonts w:ascii="Cambria Math" w:hAnsi="Cambria Math"/>
+                  <w:i/>
+                  <w:color w:val="ed7d31"/>
+                  <w:sz w:val="24"/>
+                  <w:szCs w:val="24"/>
+                </w:rPr>
+                <m:t>i</m:t>
+              </m:r>
+              <m:r>
+                <w:rPr xmlns:w="http://schemas.openxmlformats.org/wordprocessingml/2006/main">
+                  <w:rFonts w:ascii="Cambria Math" w:hAnsi="Cambria Math"/>
+                  <w:i/>
+                  <w:color w:val="ed7d31"/>
+                  <w:sz w:val="24"/>
+                  <w:szCs w:val="24"/>
+                </w:rPr>
+                <m:t>c</m:t>
+              </m:r>
+              <m:r>
+                <w:rPr xmlns:w="http://schemas.openxmlformats.org/wordprocessingml/2006/main">
+                  <w:rFonts w:ascii="Cambria Math" w:hAnsi="Cambria Math"/>
+                  <w:i/>
+                  <w:color w:val="ed7d31"/>
+                  <w:sz w:val="24"/>
+                  <w:szCs w:val="24"/>
+                </w:rPr>
+                <m:t>E</m:t>
+              </m:r>
+              <m:r>
+                <w:rPr xmlns:w="http://schemas.openxmlformats.org/wordprocessingml/2006/main">
+                  <w:rFonts w:ascii="Cambria Math" w:hAnsi="Cambria Math"/>
+                  <w:i/>
+                  <w:color w:val="ed7d31"/>
+                  <w:sz w:val="24"/>
+                  <w:szCs w:val="24"/>
+                </w:rPr>
+                <m:t>s</m:t>
+              </m:r>
+              <m:r>
+                <w:rPr xmlns:w="http://schemas.openxmlformats.org/wordprocessingml/2006/main">
+                  <w:rFonts w:ascii="Cambria Math" w:hAnsi="Cambria Math"/>
+                  <w:i/>
+                  <w:color w:val="ed7d31"/>
+                  <w:sz w:val="24"/>
+                  <w:szCs w:val="24"/>
+                </w:rPr>
+                <m:t>t</m:t>
+              </m:r>
+              <m:r>
+                <w:rPr xmlns:w="http://schemas.openxmlformats.org/wordprocessingml/2006/main">
+                  <w:rFonts w:ascii="Cambria Math" w:hAnsi="Cambria Math"/>
+                  <w:i/>
+                  <w:color w:val="ed7d31"/>
+                  <w:sz w:val="24"/>
+                  <w:szCs w:val="24"/>
+                </w:rPr>
+                <m:t>i</m:t>
+              </m:r>
+              <m:r>
+                <w:rPr xmlns:w="http://schemas.openxmlformats.org/wordprocessingml/2006/main">
+                  <w:rFonts w:ascii="Cambria Math" w:hAnsi="Cambria Math"/>
+                  <w:i/>
+                  <w:color w:val="ed7d31"/>
+                  <w:sz w:val="24"/>
+                  <w:szCs w:val="24"/>
+                </w:rPr>
+                <m:t>m</m:t>
+              </m:r>
+              <m:r>
+                <w:rPr xmlns:w="http://schemas.openxmlformats.org/wordprocessingml/2006/main">
+                  <w:rFonts w:ascii="Cambria Math" w:hAnsi="Cambria Math"/>
+                  <w:i/>
+                  <w:color w:val="ed7d31"/>
+                  <w:sz w:val="24"/>
+                  <w:szCs w:val="24"/>
+                </w:rPr>
+                <m:t>a</m:t>
+              </m:r>
+              <m:r>
+                <w:rPr xmlns:w="http://schemas.openxmlformats.org/wordprocessingml/2006/main">
+                  <w:rFonts w:ascii="Cambria Math" w:hAnsi="Cambria Math"/>
+                  <w:i/>
+                  <w:color w:val="ed7d31"/>
+                  <w:sz w:val="24"/>
+                  <w:szCs w:val="24"/>
+                </w:rPr>
+                <m:t>t</m:t>
+              </m:r>
+              <m:r>
+                <w:rPr xmlns:w="http://schemas.openxmlformats.org/wordprocessingml/2006/main">
+                  <w:rFonts w:ascii="Cambria Math" w:hAnsi="Cambria Math"/>
+                  <w:i/>
+                  <w:color w:val="ed7d31"/>
+                  <w:sz w:val="24"/>
+                  <w:szCs w:val="24"/>
+                </w:rPr>
+                <m:t>e</m:t>
+              </m:r>
             </m:num>
             <m:den>
               <m:r>
                 <w:rPr xmlns:w="http://schemas.openxmlformats.org/wordprocessingml/2006/main">
                   <w:rFonts w:ascii="Cambria Math" w:hAnsi="Cambria Math"/>
                   <w:i/>
-                  <w:color w:val="ee0000"/>
-                  <w:sz w:val="23"/>
-                  <w:szCs w:val="23"/>
+                  <w:color w:val="ed7d31"/>
+                  <w:sz w:val="24"/>
+                  <w:szCs w:val="24"/>
                 </w:rPr>
                 <m:t>6</m:t>
               </m:r>
@@ -2199,14 +2495,14 @@
           <w:szCs w:val="28"/>
           <w:u w:color="ee0000"/>
           <w:rtl w:val="0"/>
-          <w:lang w:val="en-US"/>
+          <w:lang w:val="fr-FR"/>
           <w14:textFill>
             <w14:solidFill>
               <w14:srgbClr w14:val="4472C4"/>
             </w14:solidFill>
           </w14:textFill>
         </w:rPr>
-        <w:t>PERT calculation:</w:t>
+        <w:t>PERT calculation</w:t>
       </w:r>
     </w:p>
     <w:p>
@@ -2250,7 +2546,25 @@
             </w14:solidFill>
           </w14:textFill>
         </w:rPr>
-        <w:t>Optimistic estimate:</w:t>
+        <w:t>Optimistic estimate</w:t>
+      </w:r>
+      <w:r>
+        <w:rPr>
+          <w:rFonts w:ascii="Chalkboard SE Regular" w:hAnsi="Chalkboard SE Regular"/>
+          <w:outline w:val="0"/>
+          <w:color w:val="4472c4"/>
+          <w:sz w:val="28"/>
+          <w:szCs w:val="28"/>
+          <w:u w:color="ee0000"/>
+          <w:rtl w:val="0"/>
+          <w:lang w:val="en-US"/>
+          <w14:textFill>
+            <w14:solidFill>
+              <w14:srgbClr w14:val="4472C4"/>
+            </w14:solidFill>
+          </w14:textFill>
+        </w:rPr>
+        <w:t xml:space="preserve"> =</w:t>
       </w:r>
     </w:p>
     <w:p>
@@ -2294,34 +2608,8 @@
             </w14:solidFill>
           </w14:textFill>
         </w:rPr>
-        <w:t>Pessimistic estimate:</w:t>
+        <w:t>Pessimistic estimate</w:t>
       </w:r>
-    </w:p>
-    <w:p>
-      <w:pPr>
-        <w:pStyle w:val="Body"/>
-        <w:numPr>
-          <w:ilvl w:val="0"/>
-          <w:numId w:val="3"/>
-        </w:numPr>
-        <w:bidi w:val="0"/>
-        <w:ind w:right="0"/>
-        <w:jc w:val="left"/>
-        <w:rPr>
-          <w:rFonts w:ascii="Chalkboard SE Regular" w:hAnsi="Chalkboard SE Regular"/>
-          <w:outline w:val="0"/>
-          <w:color w:val="4472c4"/>
-          <w:sz w:val="28"/>
-          <w:szCs w:val="28"/>
-          <w:rtl w:val="0"/>
-          <w:lang w:val="en-US"/>
-          <w14:textFill>
-            <w14:solidFill>
-              <w14:srgbClr w14:val="4472C4"/>
-            </w14:solidFill>
-          </w14:textFill>
-        </w:rPr>
-      </w:pPr>
       <w:r>
         <w:rPr>
           <w:rFonts w:ascii="Chalkboard SE Regular" w:hAnsi="Chalkboard SE Regular"/>
@@ -2338,7 +2626,7 @@
             </w14:solidFill>
           </w14:textFill>
         </w:rPr>
-        <w:t>Most likely estimate:</w:t>
+        <w:t xml:space="preserve"> =</w:t>
       </w:r>
     </w:p>
     <w:p>
@@ -2382,7 +2670,7 @@
             </w14:solidFill>
           </w14:textFill>
         </w:rPr>
-        <w:t>Weighted average</w:t>
+        <w:t>Most likely estimate</w:t>
       </w:r>
       <w:r>
         <w:rPr>
@@ -2400,7 +2688,69 @@
             </w14:solidFill>
           </w14:textFill>
         </w:rPr>
-        <w:t>:</w:t>
+        <w:t xml:space="preserve"> =</w:t>
+      </w:r>
+    </w:p>
+    <w:p>
+      <w:pPr>
+        <w:pStyle w:val="Body"/>
+        <w:numPr>
+          <w:ilvl w:val="0"/>
+          <w:numId w:val="3"/>
+        </w:numPr>
+        <w:bidi w:val="0"/>
+        <w:ind w:right="0"/>
+        <w:jc w:val="left"/>
+        <w:rPr>
+          <w:rFonts w:ascii="Chalkboard SE Regular" w:hAnsi="Chalkboard SE Regular"/>
+          <w:outline w:val="0"/>
+          <w:color w:val="4472c4"/>
+          <w:sz w:val="28"/>
+          <w:szCs w:val="28"/>
+          <w:rtl w:val="0"/>
+          <w:lang w:val="en-US"/>
+          <w14:textFill>
+            <w14:solidFill>
+              <w14:srgbClr w14:val="4472C4"/>
+            </w14:solidFill>
+          </w14:textFill>
+        </w:rPr>
+      </w:pPr>
+      <w:r>
+        <w:rPr>
+          <w:rFonts w:ascii="Chalkboard SE Regular" w:hAnsi="Chalkboard SE Regular"/>
+          <w:outline w:val="0"/>
+          <w:color w:val="4472c4"/>
+          <w:sz w:val="28"/>
+          <w:szCs w:val="28"/>
+          <w:u w:color="ee0000"/>
+          <w:rtl w:val="0"/>
+          <w:lang w:val="en-US"/>
+          <w14:textFill>
+            <w14:solidFill>
+              <w14:srgbClr w14:val="4472C4"/>
+            </w14:solidFill>
+          </w14:textFill>
+        </w:rPr>
+        <w:t>Weighted average</w:t>
+      </w:r>
+      <w:r>
+        <w:rPr>
+          <w:rFonts w:ascii="Chalkboard SE Regular" w:hAnsi="Chalkboard SE Regular"/>
+          <w:outline w:val="0"/>
+          <w:color w:val="4472c4"/>
+          <w:sz w:val="28"/>
+          <w:szCs w:val="28"/>
+          <w:u w:color="ee0000"/>
+          <w:rtl w:val="0"/>
+          <w:lang w:val="en-US"/>
+          <w14:textFill>
+            <w14:solidFill>
+              <w14:srgbClr w14:val="4472C4"/>
+            </w14:solidFill>
+          </w14:textFill>
+        </w:rPr>
+        <w:t xml:space="preserve"> =</w:t>
       </w:r>
     </w:p>
     <w:sectPr>
@@ -3293,7 +3643,7 @@
       <w:strike w:val="0"/>
       <w:dstrike w:val="0"/>
       <w:outline w:val="0"/>
-      <w:color w:val="4472c4"/>
+      <w:color w:val="ed7d31"/>
       <w:spacing w:val="0"/>
       <w:kern w:val="0"/>
       <w:position w:val="0"/>
@@ -3307,7 +3657,7 @@
       </w14:textOutline>
       <w14:textFill>
         <w14:solidFill>
-          <w14:srgbClr w14:val="4472C4"/>
+          <w14:srgbClr w14:val="ED7D31"/>
         </w14:solidFill>
       </w14:textFill>
     </w:rPr>
@@ -3366,6 +3716,12 @@
       <w:keepLines w:val="1"/>
       <w:pageBreakBefore w:val="0"/>
       <w:widowControl w:val="1"/>
+      <w:pBdr>
+        <w:top w:val="single" w:color="365b9c" w:sz="24" w:space="6" w:shadow="0" w:frame="0"/>
+        <w:left w:val="nil"/>
+        <w:bottom w:val="nil"/>
+        <w:right w:val="nil"/>
+      </w:pBdr>
       <w:shd w:val="clear" w:color="auto" w:fill="auto"/>
       <w:suppressAutoHyphens w:val="0"/>
       <w:bidi w:val="0"/>
@@ -3375,7 +3731,7 @@
       <w:outlineLvl w:val="0"/>
     </w:pPr>
     <w:rPr>
-      <w:rFonts w:ascii="Arial Unicode MS" w:cs="Mj_Casablanca Light" w:hAnsi="Arial Unicode MS" w:eastAsia="Arial Unicode MS" w:hint="cs"/>
+      <w:rFonts w:ascii="Arial Unicode MS" w:cs="Chalkboard SE Bold" w:hAnsi="Arial Unicode MS" w:eastAsia="Arial Unicode MS" w:hint="cs"/>
       <w:b w:val="0"/>
       <w:bCs w:val="0"/>
       <w:i w:val="0"/>
@@ -3385,13 +3741,13 @@
       <w:strike w:val="0"/>
       <w:dstrike w:val="0"/>
       <w:outline w:val="0"/>
-      <w:color w:val="2f5496"/>
+      <w:color w:val="ed7d31"/>
       <w:spacing w:val="0"/>
       <w:kern w:val="2"/>
       <w:position w:val="0"/>
-      <w:sz w:val="40"/>
-      <w:szCs w:val="40"/>
-      <w:u w:val="none" w:color="2f5496"/>
+      <w:sz w:val="28"/>
+      <w:szCs w:val="28"/>
+      <w:u w:val="none" w:color="ee0000"/>
       <w:shd w:val="nil" w:color="auto" w:fill="auto"/>
       <w:vertAlign w:val="baseline"/>
       <w14:textOutline>
@@ -3399,7 +3755,7 @@
       </w14:textOutline>
       <w14:textFill>
         <w14:solidFill>
-          <w14:srgbClr w14:val="2F5496"/>
+          <w14:srgbClr w14:val="ED7D31"/>
         </w14:solidFill>
       </w14:textFill>
     </w:rPr>

</xml_diff>